<commit_message>
saya sudah beres yang use case
</commit_message>
<xml_diff>
--- a/1_Template Perencanaan Project UKK RPL.docx
+++ b/1_Template Perencanaan Project UKK RPL.docx
@@ -4993,172 +4993,6 @@
             <w:proofErr w:type="spellStart"/>
             <w:r>
               <w:t>produk</w:t>
-            </w:r>
-            <w:proofErr w:type="spellEnd"/>
-            <w:r>
-              <w:t>.</w:t>
-            </w:r>
-          </w:p>
-        </w:tc>
-      </w:tr>
-      <w:tr>
-        <w:tblPrEx>
-          <w:tblCellMar>
-            <w:top w:w="0" w:type="dxa"/>
-            <w:bottom w:w="0" w:type="dxa"/>
-          </w:tblCellMar>
-        </w:tblPrEx>
-        <w:tc>
-          <w:tcPr>
-            <w:tcW w:w="900" w:type="dxa"/>
-            <w:tcBorders>
-              <w:top w:val="single" w:sz="4" w:space="0" w:color="000000"/>
-              <w:left w:val="single" w:sz="4" w:space="0" w:color="000000"/>
-              <w:bottom w:val="single" w:sz="4" w:space="0" w:color="000000"/>
-              <w:right w:val="single" w:sz="4" w:space="0" w:color="000000"/>
-            </w:tcBorders>
-            <w:tcMar>
-              <w:top w:w="100" w:type="dxa"/>
-              <w:left w:w="120" w:type="dxa"/>
-              <w:bottom w:w="100" w:type="dxa"/>
-              <w:right w:w="120" w:type="dxa"/>
-            </w:tcMar>
-            <w:vAlign w:val="center"/>
-          </w:tcPr>
-          <w:p>
-            <w:pPr>
-              <w:spacing w:after="120"/>
-              <w:jc w:val="center"/>
-            </w:pPr>
-            <w:r>
-              <w:t>3</w:t>
-            </w:r>
-          </w:p>
-        </w:tc>
-        <w:tc>
-          <w:tcPr>
-            <w:tcW w:w="3000" w:type="dxa"/>
-            <w:tcBorders>
-              <w:top w:val="single" w:sz="4" w:space="0" w:color="000000"/>
-              <w:left w:val="single" w:sz="4" w:space="0" w:color="000000"/>
-              <w:bottom w:val="single" w:sz="4" w:space="0" w:color="000000"/>
-              <w:right w:val="single" w:sz="4" w:space="0" w:color="000000"/>
-            </w:tcBorders>
-            <w:tcMar>
-              <w:top w:w="100" w:type="dxa"/>
-              <w:left w:w="120" w:type="dxa"/>
-              <w:bottom w:w="100" w:type="dxa"/>
-              <w:right w:w="120" w:type="dxa"/>
-            </w:tcMar>
-            <w:vAlign w:val="center"/>
-          </w:tcPr>
-          <w:p>
-            <w:pPr>
-              <w:spacing w:after="120"/>
-            </w:pPr>
-            <w:proofErr w:type="spellStart"/>
-            <w:r>
-              <w:t>Pemilik</w:t>
-            </w:r>
-            <w:proofErr w:type="spellEnd"/>
-            <w:r>
-              <w:t>/</w:t>
-            </w:r>
-            <w:proofErr w:type="spellStart"/>
-            <w:r>
-              <w:t>Manajer</w:t>
-            </w:r>
-            <w:proofErr w:type="spellEnd"/>
-          </w:p>
-        </w:tc>
-        <w:tc>
-          <w:tcPr>
-            <w:tcW w:w="5172" w:type="dxa"/>
-            <w:tcBorders>
-              <w:top w:val="single" w:sz="4" w:space="0" w:color="000000"/>
-              <w:left w:val="single" w:sz="4" w:space="0" w:color="000000"/>
-              <w:bottom w:val="single" w:sz="4" w:space="0" w:color="000000"/>
-              <w:right w:val="single" w:sz="4" w:space="0" w:color="000000"/>
-            </w:tcBorders>
-            <w:tcMar>
-              <w:top w:w="100" w:type="dxa"/>
-              <w:left w:w="120" w:type="dxa"/>
-              <w:bottom w:w="100" w:type="dxa"/>
-              <w:right w:w="120" w:type="dxa"/>
-            </w:tcMar>
-            <w:vAlign w:val="center"/>
-          </w:tcPr>
-          <w:p>
-            <w:pPr>
-              <w:spacing w:after="120"/>
-            </w:pPr>
-            <w:proofErr w:type="spellStart"/>
-            <w:r>
-              <w:t>Melihat</w:t>
-            </w:r>
-            <w:proofErr w:type="spellEnd"/>
-            <w:r>
-              <w:t xml:space="preserve"> </w:t>
-            </w:r>
-            <w:proofErr w:type="spellStart"/>
-            <w:r>
-              <w:t>informasi</w:t>
-            </w:r>
-            <w:proofErr w:type="spellEnd"/>
-            <w:r>
-              <w:t xml:space="preserve"> dan </w:t>
-            </w:r>
-            <w:proofErr w:type="spellStart"/>
-            <w:r>
-              <w:t>laporan</w:t>
-            </w:r>
-            <w:proofErr w:type="spellEnd"/>
-            <w:r>
-              <w:t xml:space="preserve"> </w:t>
-            </w:r>
-            <w:proofErr w:type="spellStart"/>
-            <w:r>
-              <w:t>penjualan</w:t>
-            </w:r>
-            <w:proofErr w:type="spellEnd"/>
-            <w:r>
-              <w:t xml:space="preserve"> </w:t>
-            </w:r>
-            <w:proofErr w:type="spellStart"/>
-            <w:r>
-              <w:t>untuk</w:t>
-            </w:r>
-            <w:proofErr w:type="spellEnd"/>
-            <w:r>
-              <w:t xml:space="preserve"> </w:t>
-            </w:r>
-            <w:proofErr w:type="spellStart"/>
-            <w:r>
-              <w:t>membantu</w:t>
-            </w:r>
-            <w:proofErr w:type="spellEnd"/>
-            <w:r>
-              <w:t xml:space="preserve"> </w:t>
-            </w:r>
-            <w:proofErr w:type="spellStart"/>
-            <w:r>
-              <w:t>memantau</w:t>
-            </w:r>
-            <w:proofErr w:type="spellEnd"/>
-            <w:r>
-              <w:t xml:space="preserve"> </w:t>
-            </w:r>
-            <w:proofErr w:type="spellStart"/>
-            <w:r>
-              <w:t>aktivitas</w:t>
-            </w:r>
-            <w:proofErr w:type="spellEnd"/>
-            <w:r>
-              <w:t xml:space="preserve"> </w:t>
-            </w:r>
-            <w:proofErr w:type="spellStart"/>
-            <w:r>
-              <w:t>penjualan</w:t>
             </w:r>
             <w:proofErr w:type="spellEnd"/>
             <w:r>
@@ -9309,6 +9143,9 @@
             <w:pPr>
               <w:spacing w:after="120"/>
             </w:pPr>
+            <w:r>
+              <w:t>Admin</w:t>
+            </w:r>
           </w:p>
         </w:tc>
         <w:tc>
@@ -9332,6 +9169,94 @@
             <w:pPr>
               <w:spacing w:after="120"/>
             </w:pPr>
+            <w:proofErr w:type="spellStart"/>
+            <w:r>
+              <w:t>Pengguna</w:t>
+            </w:r>
+            <w:proofErr w:type="spellEnd"/>
+            <w:r>
+              <w:t xml:space="preserve"> yang </w:t>
+            </w:r>
+            <w:proofErr w:type="spellStart"/>
+            <w:r>
+              <w:t>bertanggung</w:t>
+            </w:r>
+            <w:proofErr w:type="spellEnd"/>
+            <w:r>
+              <w:t xml:space="preserve"> </w:t>
+            </w:r>
+            <w:proofErr w:type="spellStart"/>
+            <w:r>
+              <w:t>jawab</w:t>
+            </w:r>
+            <w:proofErr w:type="spellEnd"/>
+            <w:r>
+              <w:t xml:space="preserve"> </w:t>
+            </w:r>
+            <w:proofErr w:type="spellStart"/>
+            <w:r>
+              <w:t>mengelola</w:t>
+            </w:r>
+            <w:proofErr w:type="spellEnd"/>
+            <w:r>
+              <w:t xml:space="preserve"> data </w:t>
+            </w:r>
+            <w:proofErr w:type="spellStart"/>
+            <w:r>
+              <w:t>produk</w:t>
+            </w:r>
+            <w:proofErr w:type="spellEnd"/>
+            <w:r>
+              <w:t xml:space="preserve">, </w:t>
+            </w:r>
+            <w:proofErr w:type="spellStart"/>
+            <w:r>
+              <w:t>pelanggan</w:t>
+            </w:r>
+            <w:proofErr w:type="spellEnd"/>
+            <w:r>
+              <w:t xml:space="preserve">, </w:t>
+            </w:r>
+            <w:proofErr w:type="spellStart"/>
+            <w:r>
+              <w:t>stok</w:t>
+            </w:r>
+            <w:proofErr w:type="spellEnd"/>
+            <w:r>
+              <w:t xml:space="preserve">, </w:t>
+            </w:r>
+            <w:proofErr w:type="spellStart"/>
+            <w:r>
+              <w:t>pengguna</w:t>
+            </w:r>
+            <w:proofErr w:type="spellEnd"/>
+            <w:r>
+              <w:t xml:space="preserve">, </w:t>
+            </w:r>
+            <w:proofErr w:type="spellStart"/>
+            <w:r>
+              <w:t>transaksi</w:t>
+            </w:r>
+            <w:proofErr w:type="spellEnd"/>
+            <w:r>
+              <w:t xml:space="preserve">, dan </w:t>
+            </w:r>
+            <w:proofErr w:type="spellStart"/>
+            <w:r>
+              <w:t>laporan</w:t>
+            </w:r>
+            <w:proofErr w:type="spellEnd"/>
+            <w:r>
+              <w:t xml:space="preserve"> </w:t>
+            </w:r>
+            <w:proofErr w:type="spellStart"/>
+            <w:r>
+              <w:t>penjualan</w:t>
+            </w:r>
+            <w:proofErr w:type="spellEnd"/>
+            <w:r>
+              <w:t>.</w:t>
+            </w:r>
           </w:p>
         </w:tc>
       </w:tr>
@@ -9390,6 +9315,9 @@
             <w:pPr>
               <w:spacing w:after="120"/>
             </w:pPr>
+            <w:r>
+              <w:t>Kasir</w:t>
+            </w:r>
           </w:p>
         </w:tc>
         <w:tc>
@@ -9413,168 +9341,102 @@
             <w:pPr>
               <w:spacing w:after="120"/>
             </w:pPr>
-          </w:p>
-        </w:tc>
-      </w:tr>
-      <w:tr>
-        <w:tblPrEx>
-          <w:tblCellMar>
-            <w:top w:w="0" w:type="dxa"/>
-            <w:bottom w:w="0" w:type="dxa"/>
-          </w:tblCellMar>
-        </w:tblPrEx>
-        <w:tc>
-          <w:tcPr>
-            <w:tcW w:w="700" w:type="dxa"/>
-            <w:tcBorders>
-              <w:top w:val="single" w:sz="4" w:space="0" w:color="000000"/>
-              <w:left w:val="single" w:sz="4" w:space="0" w:color="000000"/>
-              <w:bottom w:val="single" w:sz="4" w:space="0" w:color="000000"/>
-              <w:right w:val="single" w:sz="4" w:space="0" w:color="000000"/>
-            </w:tcBorders>
-            <w:tcMar>
-              <w:top w:w="100" w:type="dxa"/>
-              <w:left w:w="120" w:type="dxa"/>
-              <w:bottom w:w="100" w:type="dxa"/>
-              <w:right w:w="120" w:type="dxa"/>
-            </w:tcMar>
-            <w:vAlign w:val="center"/>
-          </w:tcPr>
-          <w:p>
-            <w:pPr>
-              <w:spacing w:after="120"/>
-              <w:jc w:val="center"/>
-            </w:pPr>
-            <w:r>
-              <w:t>3</w:t>
-            </w:r>
-          </w:p>
-        </w:tc>
-        <w:tc>
-          <w:tcPr>
-            <w:tcW w:w="2500" w:type="dxa"/>
-            <w:tcBorders>
-              <w:top w:val="single" w:sz="4" w:space="0" w:color="000000"/>
-              <w:left w:val="single" w:sz="4" w:space="0" w:color="000000"/>
-              <w:bottom w:val="single" w:sz="4" w:space="0" w:color="000000"/>
-              <w:right w:val="single" w:sz="4" w:space="0" w:color="000000"/>
-            </w:tcBorders>
-            <w:tcMar>
-              <w:top w:w="100" w:type="dxa"/>
-              <w:left w:w="120" w:type="dxa"/>
-              <w:bottom w:w="100" w:type="dxa"/>
-              <w:right w:w="120" w:type="dxa"/>
-            </w:tcMar>
-            <w:vAlign w:val="center"/>
-          </w:tcPr>
-          <w:p>
-            <w:pPr>
-              <w:spacing w:after="120"/>
-            </w:pPr>
-          </w:p>
-        </w:tc>
-        <w:tc>
-          <w:tcPr>
-            <w:tcW w:w="5872" w:type="dxa"/>
-            <w:tcBorders>
-              <w:top w:val="single" w:sz="4" w:space="0" w:color="000000"/>
-              <w:left w:val="single" w:sz="4" w:space="0" w:color="000000"/>
-              <w:bottom w:val="single" w:sz="4" w:space="0" w:color="000000"/>
-              <w:right w:val="single" w:sz="4" w:space="0" w:color="000000"/>
-            </w:tcBorders>
-            <w:tcMar>
-              <w:top w:w="100" w:type="dxa"/>
-              <w:left w:w="120" w:type="dxa"/>
-              <w:bottom w:w="100" w:type="dxa"/>
-              <w:right w:w="120" w:type="dxa"/>
-            </w:tcMar>
-            <w:vAlign w:val="center"/>
-          </w:tcPr>
-          <w:p>
-            <w:pPr>
-              <w:spacing w:after="120"/>
-            </w:pPr>
-          </w:p>
-        </w:tc>
-      </w:tr>
-      <w:tr>
-        <w:tblPrEx>
-          <w:tblCellMar>
-            <w:top w:w="0" w:type="dxa"/>
-            <w:bottom w:w="0" w:type="dxa"/>
-          </w:tblCellMar>
-        </w:tblPrEx>
-        <w:tc>
-          <w:tcPr>
-            <w:tcW w:w="700" w:type="dxa"/>
-            <w:tcBorders>
-              <w:top w:val="single" w:sz="4" w:space="0" w:color="000000"/>
-              <w:left w:val="single" w:sz="4" w:space="0" w:color="000000"/>
-              <w:bottom w:val="single" w:sz="4" w:space="0" w:color="000000"/>
-              <w:right w:val="single" w:sz="4" w:space="0" w:color="000000"/>
-            </w:tcBorders>
-            <w:tcMar>
-              <w:top w:w="100" w:type="dxa"/>
-              <w:left w:w="120" w:type="dxa"/>
-              <w:bottom w:w="100" w:type="dxa"/>
-              <w:right w:w="120" w:type="dxa"/>
-            </w:tcMar>
-            <w:vAlign w:val="center"/>
-          </w:tcPr>
-          <w:p>
-            <w:pPr>
-              <w:spacing w:after="120"/>
-              <w:jc w:val="center"/>
-            </w:pPr>
-            <w:r>
-              <w:t>4</w:t>
-            </w:r>
-          </w:p>
-        </w:tc>
-        <w:tc>
-          <w:tcPr>
-            <w:tcW w:w="2500" w:type="dxa"/>
-            <w:tcBorders>
-              <w:top w:val="single" w:sz="4" w:space="0" w:color="000000"/>
-              <w:left w:val="single" w:sz="4" w:space="0" w:color="000000"/>
-              <w:bottom w:val="single" w:sz="4" w:space="0" w:color="000000"/>
-              <w:right w:val="single" w:sz="4" w:space="0" w:color="000000"/>
-            </w:tcBorders>
-            <w:tcMar>
-              <w:top w:w="100" w:type="dxa"/>
-              <w:left w:w="120" w:type="dxa"/>
-              <w:bottom w:w="100" w:type="dxa"/>
-              <w:right w:w="120" w:type="dxa"/>
-            </w:tcMar>
-            <w:vAlign w:val="center"/>
-          </w:tcPr>
-          <w:p>
-            <w:pPr>
-              <w:spacing w:after="120"/>
-            </w:pPr>
-          </w:p>
-        </w:tc>
-        <w:tc>
-          <w:tcPr>
-            <w:tcW w:w="5872" w:type="dxa"/>
-            <w:tcBorders>
-              <w:top w:val="single" w:sz="4" w:space="0" w:color="000000"/>
-              <w:left w:val="single" w:sz="4" w:space="0" w:color="000000"/>
-              <w:bottom w:val="single" w:sz="4" w:space="0" w:color="000000"/>
-              <w:right w:val="single" w:sz="4" w:space="0" w:color="000000"/>
-            </w:tcBorders>
-            <w:tcMar>
-              <w:top w:w="100" w:type="dxa"/>
-              <w:left w:w="120" w:type="dxa"/>
-              <w:bottom w:w="100" w:type="dxa"/>
-              <w:right w:w="120" w:type="dxa"/>
-            </w:tcMar>
-            <w:vAlign w:val="center"/>
-          </w:tcPr>
-          <w:p>
-            <w:pPr>
-              <w:spacing w:after="120"/>
-            </w:pPr>
+            <w:proofErr w:type="spellStart"/>
+            <w:r>
+              <w:t>Pengguna</w:t>
+            </w:r>
+            <w:proofErr w:type="spellEnd"/>
+            <w:r>
+              <w:t xml:space="preserve"> yang </w:t>
+            </w:r>
+            <w:proofErr w:type="spellStart"/>
+            <w:r>
+              <w:t>bertanggung</w:t>
+            </w:r>
+            <w:proofErr w:type="spellEnd"/>
+            <w:r>
+              <w:t xml:space="preserve"> </w:t>
+            </w:r>
+            <w:proofErr w:type="spellStart"/>
+            <w:r>
+              <w:t>jawab</w:t>
+            </w:r>
+            <w:proofErr w:type="spellEnd"/>
+            <w:r>
+              <w:t xml:space="preserve"> </w:t>
+            </w:r>
+            <w:proofErr w:type="spellStart"/>
+            <w:r>
+              <w:t>melakukan</w:t>
+            </w:r>
+            <w:proofErr w:type="spellEnd"/>
+            <w:r>
+              <w:t xml:space="preserve"> </w:t>
+            </w:r>
+            <w:proofErr w:type="spellStart"/>
+            <w:r>
+              <w:t>transaksi</w:t>
+            </w:r>
+            <w:proofErr w:type="spellEnd"/>
+            <w:r>
+              <w:t xml:space="preserve"> </w:t>
+            </w:r>
+            <w:proofErr w:type="spellStart"/>
+            <w:r>
+              <w:t>penjualan</w:t>
+            </w:r>
+            <w:proofErr w:type="spellEnd"/>
+            <w:r>
+              <w:t xml:space="preserve">, </w:t>
+            </w:r>
+            <w:proofErr w:type="spellStart"/>
+            <w:r>
+              <w:t>mencari</w:t>
+            </w:r>
+            <w:proofErr w:type="spellEnd"/>
+            <w:r>
+              <w:t xml:space="preserve"> data </w:t>
+            </w:r>
+            <w:proofErr w:type="spellStart"/>
+            <w:r>
+              <w:t>pelanggan</w:t>
+            </w:r>
+            <w:proofErr w:type="spellEnd"/>
+            <w:r>
+              <w:t xml:space="preserve">, dan </w:t>
+            </w:r>
+            <w:proofErr w:type="spellStart"/>
+            <w:r>
+              <w:t>melihat</w:t>
+            </w:r>
+            <w:proofErr w:type="spellEnd"/>
+            <w:r>
+              <w:t xml:space="preserve"> </w:t>
+            </w:r>
+            <w:proofErr w:type="spellStart"/>
+            <w:r>
+              <w:t>informasi</w:t>
+            </w:r>
+            <w:proofErr w:type="spellEnd"/>
+            <w:r>
+              <w:t xml:space="preserve"> </w:t>
+            </w:r>
+            <w:proofErr w:type="spellStart"/>
+            <w:r>
+              <w:t>stok</w:t>
+            </w:r>
+            <w:proofErr w:type="spellEnd"/>
+            <w:r>
+              <w:t xml:space="preserve"> </w:t>
+            </w:r>
+            <w:proofErr w:type="spellStart"/>
+            <w:r>
+              <w:t>produk</w:t>
+            </w:r>
+            <w:proofErr w:type="spellEnd"/>
+            <w:r>
+              <w:t>.</w:t>
+            </w:r>
           </w:p>
         </w:tc>
       </w:tr>
@@ -9777,6 +9639,9 @@
             <w:pPr>
               <w:spacing w:after="120"/>
             </w:pPr>
+            <w:r>
+              <w:t>Login</w:t>
+            </w:r>
           </w:p>
         </w:tc>
         <w:tc>
@@ -9800,6 +9665,9 @@
             <w:pPr>
               <w:spacing w:after="120"/>
             </w:pPr>
+            <w:r>
+              <w:t>Admin, Kasir</w:t>
+            </w:r>
           </w:p>
         </w:tc>
       </w:tr>
@@ -9858,6 +9726,19 @@
             <w:pPr>
               <w:spacing w:after="120"/>
             </w:pPr>
+            <w:proofErr w:type="spellStart"/>
+            <w:r>
+              <w:t>Mengelola</w:t>
+            </w:r>
+            <w:proofErr w:type="spellEnd"/>
+            <w:r>
+              <w:t xml:space="preserve"> </w:t>
+            </w:r>
+            <w:proofErr w:type="spellStart"/>
+            <w:r>
+              <w:t>Produk</w:t>
+            </w:r>
+            <w:proofErr w:type="spellEnd"/>
           </w:p>
         </w:tc>
         <w:tc>
@@ -9877,6 +9758,83 @@
             </w:tcMar>
             <w:vAlign w:val="center"/>
           </w:tcPr>
+          <w:tbl>
+            <w:tblPr>
+              <w:tblW w:w="0" w:type="auto"/>
+              <w:tblCellSpacing w:w="15" w:type="dxa"/>
+              <w:tblCellMar>
+                <w:top w:w="15" w:type="dxa"/>
+                <w:left w:w="15" w:type="dxa"/>
+                <w:bottom w:w="15" w:type="dxa"/>
+                <w:right w:w="15" w:type="dxa"/>
+              </w:tblCellMar>
+              <w:tblLook w:val="04A0" w:firstRow="1" w:lastRow="0" w:firstColumn="1" w:lastColumn="0" w:noHBand="0" w:noVBand="1"/>
+            </w:tblPr>
+            <w:tblGrid>
+              <w:gridCol w:w="96"/>
+            </w:tblGrid>
+            <w:tr>
+              <w:trPr>
+                <w:tblCellSpacing w:w="15" w:type="dxa"/>
+              </w:trPr>
+              <w:tc>
+                <w:tcPr>
+                  <w:tcW w:w="0" w:type="auto"/>
+                  <w:vAlign w:val="center"/>
+                  <w:hideMark/>
+                </w:tcPr>
+                <w:p>
+                  <w:pPr>
+                    <w:spacing w:after="120"/>
+                  </w:pPr>
+                </w:p>
+              </w:tc>
+            </w:tr>
+          </w:tbl>
+          <w:p>
+            <w:pPr>
+              <w:spacing w:after="120"/>
+              <w:rPr>
+                <w:vanish/>
+              </w:rPr>
+            </w:pPr>
+          </w:p>
+          <w:tbl>
+            <w:tblPr>
+              <w:tblW w:w="0" w:type="auto"/>
+              <w:tblCellSpacing w:w="15" w:type="dxa"/>
+              <w:tblCellMar>
+                <w:top w:w="15" w:type="dxa"/>
+                <w:left w:w="15" w:type="dxa"/>
+                <w:bottom w:w="15" w:type="dxa"/>
+                <w:right w:w="15" w:type="dxa"/>
+              </w:tblCellMar>
+              <w:tblLook w:val="04A0" w:firstRow="1" w:lastRow="0" w:firstColumn="1" w:lastColumn="0" w:noHBand="0" w:noVBand="1"/>
+            </w:tblPr>
+            <w:tblGrid>
+              <w:gridCol w:w="714"/>
+            </w:tblGrid>
+            <w:tr>
+              <w:trPr>
+                <w:tblCellSpacing w:w="15" w:type="dxa"/>
+              </w:trPr>
+              <w:tc>
+                <w:tcPr>
+                  <w:tcW w:w="0" w:type="auto"/>
+                  <w:vAlign w:val="center"/>
+                  <w:hideMark/>
+                </w:tcPr>
+                <w:p>
+                  <w:pPr>
+                    <w:spacing w:after="120"/>
+                  </w:pPr>
+                  <w:r>
+                    <w:t>Admin</w:t>
+                  </w:r>
+                </w:p>
+              </w:tc>
+            </w:tr>
+          </w:tbl>
           <w:p>
             <w:pPr>
               <w:spacing w:after="120"/>
@@ -9939,6 +9897,19 @@
             <w:pPr>
               <w:spacing w:after="120"/>
             </w:pPr>
+            <w:proofErr w:type="spellStart"/>
+            <w:r>
+              <w:t>Mengelola</w:t>
+            </w:r>
+            <w:proofErr w:type="spellEnd"/>
+            <w:r>
+              <w:t xml:space="preserve"> </w:t>
+            </w:r>
+            <w:proofErr w:type="spellStart"/>
+            <w:r>
+              <w:t>Pelanggan</w:t>
+            </w:r>
+            <w:proofErr w:type="spellEnd"/>
           </w:p>
         </w:tc>
         <w:tc>
@@ -9962,6 +9933,9 @@
             <w:pPr>
               <w:spacing w:after="120"/>
             </w:pPr>
+            <w:r>
+              <w:t>Admin, Kasir</w:t>
+            </w:r>
           </w:p>
         </w:tc>
       </w:tr>
@@ -10020,6 +9994,19 @@
             <w:pPr>
               <w:spacing w:after="120"/>
             </w:pPr>
+            <w:proofErr w:type="spellStart"/>
+            <w:r>
+              <w:t>Melihat</w:t>
+            </w:r>
+            <w:proofErr w:type="spellEnd"/>
+            <w:r>
+              <w:t xml:space="preserve"> Stok </w:t>
+            </w:r>
+            <w:proofErr w:type="spellStart"/>
+            <w:r>
+              <w:t>Produk</w:t>
+            </w:r>
+            <w:proofErr w:type="spellEnd"/>
           </w:p>
         </w:tc>
         <w:tc>
@@ -10043,6 +10030,9 @@
             <w:pPr>
               <w:spacing w:after="120"/>
             </w:pPr>
+            <w:r>
+              <w:t>Admin, Kasir</w:t>
+            </w:r>
           </w:p>
         </w:tc>
       </w:tr>
@@ -10053,6 +10043,9 @@
             <w:bottom w:w="0" w:type="dxa"/>
           </w:tblCellMar>
         </w:tblPrEx>
+        <w:trPr>
+          <w:trHeight w:val="570"/>
+        </w:trPr>
         <w:tc>
           <w:tcPr>
             <w:tcW w:w="700" w:type="dxa"/>
@@ -10101,6 +10094,27 @@
             <w:pPr>
               <w:spacing w:after="120"/>
             </w:pPr>
+            <w:proofErr w:type="spellStart"/>
+            <w:r>
+              <w:t>Melakukan</w:t>
+            </w:r>
+            <w:proofErr w:type="spellEnd"/>
+            <w:r>
+              <w:t xml:space="preserve"> </w:t>
+            </w:r>
+            <w:proofErr w:type="spellStart"/>
+            <w:r>
+              <w:t>Transaksi</w:t>
+            </w:r>
+            <w:proofErr w:type="spellEnd"/>
+            <w:r>
+              <w:t xml:space="preserve"> </w:t>
+            </w:r>
+            <w:proofErr w:type="spellStart"/>
+            <w:r>
+              <w:t>Penjualan</w:t>
+            </w:r>
+            <w:proofErr w:type="spellEnd"/>
           </w:p>
         </w:tc>
         <w:tc>
@@ -10120,6 +10134,677 @@
             </w:tcMar>
             <w:vAlign w:val="center"/>
           </w:tcPr>
+          <w:tbl>
+            <w:tblPr>
+              <w:tblW w:w="0" w:type="auto"/>
+              <w:tblCellSpacing w:w="15" w:type="dxa"/>
+              <w:tblCellMar>
+                <w:top w:w="15" w:type="dxa"/>
+                <w:left w:w="15" w:type="dxa"/>
+                <w:bottom w:w="15" w:type="dxa"/>
+                <w:right w:w="15" w:type="dxa"/>
+              </w:tblCellMar>
+              <w:tblLook w:val="04A0" w:firstRow="1" w:lastRow="0" w:firstColumn="1" w:lastColumn="0" w:noHBand="0" w:noVBand="1"/>
+            </w:tblPr>
+            <w:tblGrid>
+              <w:gridCol w:w="96"/>
+            </w:tblGrid>
+            <w:tr>
+              <w:trPr>
+                <w:tblCellSpacing w:w="15" w:type="dxa"/>
+              </w:trPr>
+              <w:tc>
+                <w:tcPr>
+                  <w:tcW w:w="0" w:type="auto"/>
+                  <w:vAlign w:val="center"/>
+                  <w:hideMark/>
+                </w:tcPr>
+                <w:p>
+                  <w:pPr>
+                    <w:spacing w:after="120"/>
+                  </w:pPr>
+                </w:p>
+              </w:tc>
+            </w:tr>
+          </w:tbl>
+          <w:p>
+            <w:pPr>
+              <w:spacing w:after="120"/>
+              <w:rPr>
+                <w:vanish/>
+              </w:rPr>
+            </w:pPr>
+          </w:p>
+          <w:tbl>
+            <w:tblPr>
+              <w:tblW w:w="0" w:type="auto"/>
+              <w:tblCellSpacing w:w="15" w:type="dxa"/>
+              <w:tblCellMar>
+                <w:top w:w="15" w:type="dxa"/>
+                <w:left w:w="15" w:type="dxa"/>
+                <w:bottom w:w="15" w:type="dxa"/>
+                <w:right w:w="15" w:type="dxa"/>
+              </w:tblCellMar>
+              <w:tblLook w:val="04A0" w:firstRow="1" w:lastRow="0" w:firstColumn="1" w:lastColumn="0" w:noHBand="0" w:noVBand="1"/>
+            </w:tblPr>
+            <w:tblGrid>
+              <w:gridCol w:w="592"/>
+            </w:tblGrid>
+            <w:tr>
+              <w:trPr>
+                <w:tblCellSpacing w:w="15" w:type="dxa"/>
+              </w:trPr>
+              <w:tc>
+                <w:tcPr>
+                  <w:tcW w:w="0" w:type="auto"/>
+                  <w:vAlign w:val="center"/>
+                  <w:hideMark/>
+                </w:tcPr>
+                <w:p>
+                  <w:pPr>
+                    <w:spacing w:after="120"/>
+                  </w:pPr>
+                  <w:r>
+                    <w:t>Kasir</w:t>
+                  </w:r>
+                </w:p>
+              </w:tc>
+            </w:tr>
+          </w:tbl>
+          <w:p>
+            <w:pPr>
+              <w:spacing w:after="120"/>
+            </w:pPr>
+          </w:p>
+        </w:tc>
+      </w:tr>
+      <w:tr>
+        <w:tblPrEx>
+          <w:tblCellMar>
+            <w:top w:w="0" w:type="dxa"/>
+            <w:bottom w:w="0" w:type="dxa"/>
+          </w:tblCellMar>
+        </w:tblPrEx>
+        <w:trPr>
+          <w:trHeight w:val="570"/>
+        </w:trPr>
+        <w:tc>
+          <w:tcPr>
+            <w:tcW w:w="700" w:type="dxa"/>
+            <w:tcBorders>
+              <w:top w:val="single" w:sz="4" w:space="0" w:color="000000"/>
+              <w:left w:val="single" w:sz="4" w:space="0" w:color="000000"/>
+              <w:bottom w:val="single" w:sz="4" w:space="0" w:color="000000"/>
+              <w:right w:val="single" w:sz="4" w:space="0" w:color="000000"/>
+            </w:tcBorders>
+            <w:tcMar>
+              <w:top w:w="100" w:type="dxa"/>
+              <w:left w:w="120" w:type="dxa"/>
+              <w:bottom w:w="100" w:type="dxa"/>
+              <w:right w:w="120" w:type="dxa"/>
+            </w:tcMar>
+            <w:vAlign w:val="center"/>
+          </w:tcPr>
+          <w:p>
+            <w:pPr>
+              <w:spacing w:after="120"/>
+              <w:jc w:val="center"/>
+            </w:pPr>
+            <w:r>
+              <w:t>6</w:t>
+            </w:r>
+          </w:p>
+        </w:tc>
+        <w:tc>
+          <w:tcPr>
+            <w:tcW w:w="3200" w:type="dxa"/>
+            <w:tcBorders>
+              <w:top w:val="single" w:sz="4" w:space="0" w:color="000000"/>
+              <w:left w:val="single" w:sz="4" w:space="0" w:color="000000"/>
+              <w:bottom w:val="single" w:sz="4" w:space="0" w:color="000000"/>
+              <w:right w:val="single" w:sz="4" w:space="0" w:color="000000"/>
+            </w:tcBorders>
+            <w:tcMar>
+              <w:top w:w="100" w:type="dxa"/>
+              <w:left w:w="120" w:type="dxa"/>
+              <w:bottom w:w="100" w:type="dxa"/>
+              <w:right w:w="120" w:type="dxa"/>
+            </w:tcMar>
+            <w:vAlign w:val="center"/>
+          </w:tcPr>
+          <w:p>
+            <w:pPr>
+              <w:spacing w:after="120"/>
+            </w:pPr>
+            <w:proofErr w:type="spellStart"/>
+            <w:r>
+              <w:t>Melihat</w:t>
+            </w:r>
+            <w:proofErr w:type="spellEnd"/>
+            <w:r>
+              <w:t xml:space="preserve"> Riwayat </w:t>
+            </w:r>
+            <w:proofErr w:type="spellStart"/>
+            <w:r>
+              <w:t>Transaksi</w:t>
+            </w:r>
+            <w:proofErr w:type="spellEnd"/>
+          </w:p>
+        </w:tc>
+        <w:tc>
+          <w:tcPr>
+            <w:tcW w:w="5172" w:type="dxa"/>
+            <w:tcBorders>
+              <w:top w:val="single" w:sz="4" w:space="0" w:color="000000"/>
+              <w:left w:val="single" w:sz="4" w:space="0" w:color="000000"/>
+              <w:bottom w:val="single" w:sz="4" w:space="0" w:color="000000"/>
+              <w:right w:val="single" w:sz="4" w:space="0" w:color="000000"/>
+            </w:tcBorders>
+            <w:tcMar>
+              <w:top w:w="100" w:type="dxa"/>
+              <w:left w:w="120" w:type="dxa"/>
+              <w:bottom w:w="100" w:type="dxa"/>
+              <w:right w:w="120" w:type="dxa"/>
+            </w:tcMar>
+            <w:vAlign w:val="center"/>
+          </w:tcPr>
+          <w:tbl>
+            <w:tblPr>
+              <w:tblW w:w="0" w:type="auto"/>
+              <w:tblCellSpacing w:w="15" w:type="dxa"/>
+              <w:tblCellMar>
+                <w:top w:w="15" w:type="dxa"/>
+                <w:left w:w="15" w:type="dxa"/>
+                <w:bottom w:w="15" w:type="dxa"/>
+                <w:right w:w="15" w:type="dxa"/>
+              </w:tblCellMar>
+              <w:tblLook w:val="04A0" w:firstRow="1" w:lastRow="0" w:firstColumn="1" w:lastColumn="0" w:noHBand="0" w:noVBand="1"/>
+            </w:tblPr>
+            <w:tblGrid>
+              <w:gridCol w:w="96"/>
+            </w:tblGrid>
+            <w:tr>
+              <w:trPr>
+                <w:tblCellSpacing w:w="15" w:type="dxa"/>
+              </w:trPr>
+              <w:tc>
+                <w:tcPr>
+                  <w:tcW w:w="0" w:type="auto"/>
+                  <w:vAlign w:val="center"/>
+                  <w:hideMark/>
+                </w:tcPr>
+                <w:p>
+                  <w:pPr>
+                    <w:spacing w:after="120"/>
+                  </w:pPr>
+                </w:p>
+              </w:tc>
+            </w:tr>
+          </w:tbl>
+          <w:p>
+            <w:pPr>
+              <w:spacing w:after="120"/>
+              <w:rPr>
+                <w:vanish/>
+              </w:rPr>
+            </w:pPr>
+          </w:p>
+          <w:tbl>
+            <w:tblPr>
+              <w:tblW w:w="0" w:type="auto"/>
+              <w:tblCellSpacing w:w="15" w:type="dxa"/>
+              <w:tblCellMar>
+                <w:top w:w="15" w:type="dxa"/>
+                <w:left w:w="15" w:type="dxa"/>
+                <w:bottom w:w="15" w:type="dxa"/>
+                <w:right w:w="15" w:type="dxa"/>
+              </w:tblCellMar>
+              <w:tblLook w:val="04A0" w:firstRow="1" w:lastRow="0" w:firstColumn="1" w:lastColumn="0" w:noHBand="0" w:noVBand="1"/>
+            </w:tblPr>
+            <w:tblGrid>
+              <w:gridCol w:w="1338"/>
+            </w:tblGrid>
+            <w:tr>
+              <w:trPr>
+                <w:tblCellSpacing w:w="15" w:type="dxa"/>
+              </w:trPr>
+              <w:tc>
+                <w:tcPr>
+                  <w:tcW w:w="0" w:type="auto"/>
+                  <w:vAlign w:val="center"/>
+                  <w:hideMark/>
+                </w:tcPr>
+                <w:p>
+                  <w:pPr>
+                    <w:spacing w:after="120"/>
+                  </w:pPr>
+                  <w:r>
+                    <w:t>Admin, Kasir</w:t>
+                  </w:r>
+                </w:p>
+              </w:tc>
+            </w:tr>
+          </w:tbl>
+          <w:p>
+            <w:pPr>
+              <w:spacing w:after="120"/>
+            </w:pPr>
+          </w:p>
+        </w:tc>
+      </w:tr>
+      <w:tr>
+        <w:tblPrEx>
+          <w:tblCellMar>
+            <w:top w:w="0" w:type="dxa"/>
+            <w:bottom w:w="0" w:type="dxa"/>
+          </w:tblCellMar>
+        </w:tblPrEx>
+        <w:trPr>
+          <w:trHeight w:val="570"/>
+        </w:trPr>
+        <w:tc>
+          <w:tcPr>
+            <w:tcW w:w="700" w:type="dxa"/>
+            <w:tcBorders>
+              <w:top w:val="single" w:sz="4" w:space="0" w:color="000000"/>
+              <w:left w:val="single" w:sz="4" w:space="0" w:color="000000"/>
+              <w:bottom w:val="single" w:sz="4" w:space="0" w:color="000000"/>
+              <w:right w:val="single" w:sz="4" w:space="0" w:color="000000"/>
+            </w:tcBorders>
+            <w:tcMar>
+              <w:top w:w="100" w:type="dxa"/>
+              <w:left w:w="120" w:type="dxa"/>
+              <w:bottom w:w="100" w:type="dxa"/>
+              <w:right w:w="120" w:type="dxa"/>
+            </w:tcMar>
+            <w:vAlign w:val="center"/>
+          </w:tcPr>
+          <w:p>
+            <w:pPr>
+              <w:spacing w:after="120"/>
+              <w:jc w:val="center"/>
+            </w:pPr>
+            <w:r>
+              <w:t>7</w:t>
+            </w:r>
+          </w:p>
+        </w:tc>
+        <w:tc>
+          <w:tcPr>
+            <w:tcW w:w="3200" w:type="dxa"/>
+            <w:tcBorders>
+              <w:top w:val="single" w:sz="4" w:space="0" w:color="000000"/>
+              <w:left w:val="single" w:sz="4" w:space="0" w:color="000000"/>
+              <w:bottom w:val="single" w:sz="4" w:space="0" w:color="000000"/>
+              <w:right w:val="single" w:sz="4" w:space="0" w:color="000000"/>
+            </w:tcBorders>
+            <w:tcMar>
+              <w:top w:w="100" w:type="dxa"/>
+              <w:left w:w="120" w:type="dxa"/>
+              <w:bottom w:w="100" w:type="dxa"/>
+              <w:right w:w="120" w:type="dxa"/>
+            </w:tcMar>
+            <w:vAlign w:val="center"/>
+          </w:tcPr>
+          <w:p>
+            <w:pPr>
+              <w:spacing w:after="120"/>
+            </w:pPr>
+            <w:proofErr w:type="spellStart"/>
+            <w:r>
+              <w:t>Melihat</w:t>
+            </w:r>
+            <w:proofErr w:type="spellEnd"/>
+            <w:r>
+              <w:t xml:space="preserve"> </w:t>
+            </w:r>
+            <w:proofErr w:type="spellStart"/>
+            <w:r>
+              <w:t>Laporan</w:t>
+            </w:r>
+            <w:proofErr w:type="spellEnd"/>
+            <w:r>
+              <w:t xml:space="preserve"> </w:t>
+            </w:r>
+            <w:proofErr w:type="spellStart"/>
+            <w:r>
+              <w:t>Penjualan</w:t>
+            </w:r>
+            <w:proofErr w:type="spellEnd"/>
+          </w:p>
+        </w:tc>
+        <w:tc>
+          <w:tcPr>
+            <w:tcW w:w="5172" w:type="dxa"/>
+            <w:tcBorders>
+              <w:top w:val="single" w:sz="4" w:space="0" w:color="000000"/>
+              <w:left w:val="single" w:sz="4" w:space="0" w:color="000000"/>
+              <w:bottom w:val="single" w:sz="4" w:space="0" w:color="000000"/>
+              <w:right w:val="single" w:sz="4" w:space="0" w:color="000000"/>
+            </w:tcBorders>
+            <w:tcMar>
+              <w:top w:w="100" w:type="dxa"/>
+              <w:left w:w="120" w:type="dxa"/>
+              <w:bottom w:w="100" w:type="dxa"/>
+              <w:right w:w="120" w:type="dxa"/>
+            </w:tcMar>
+            <w:vAlign w:val="center"/>
+          </w:tcPr>
+          <w:tbl>
+            <w:tblPr>
+              <w:tblW w:w="0" w:type="auto"/>
+              <w:tblCellSpacing w:w="15" w:type="dxa"/>
+              <w:tblCellMar>
+                <w:top w:w="15" w:type="dxa"/>
+                <w:left w:w="15" w:type="dxa"/>
+                <w:bottom w:w="15" w:type="dxa"/>
+                <w:right w:w="15" w:type="dxa"/>
+              </w:tblCellMar>
+              <w:tblLook w:val="04A0" w:firstRow="1" w:lastRow="0" w:firstColumn="1" w:lastColumn="0" w:noHBand="0" w:noVBand="1"/>
+            </w:tblPr>
+            <w:tblGrid>
+              <w:gridCol w:w="96"/>
+            </w:tblGrid>
+            <w:tr>
+              <w:trPr>
+                <w:tblCellSpacing w:w="15" w:type="dxa"/>
+              </w:trPr>
+              <w:tc>
+                <w:tcPr>
+                  <w:tcW w:w="0" w:type="auto"/>
+                  <w:vAlign w:val="center"/>
+                  <w:hideMark/>
+                </w:tcPr>
+                <w:p>
+                  <w:pPr>
+                    <w:spacing w:after="120"/>
+                  </w:pPr>
+                </w:p>
+              </w:tc>
+            </w:tr>
+          </w:tbl>
+          <w:p>
+            <w:pPr>
+              <w:spacing w:after="120"/>
+              <w:rPr>
+                <w:vanish/>
+              </w:rPr>
+            </w:pPr>
+          </w:p>
+          <w:tbl>
+            <w:tblPr>
+              <w:tblW w:w="0" w:type="auto"/>
+              <w:tblCellSpacing w:w="15" w:type="dxa"/>
+              <w:tblCellMar>
+                <w:top w:w="15" w:type="dxa"/>
+                <w:left w:w="15" w:type="dxa"/>
+                <w:bottom w:w="15" w:type="dxa"/>
+                <w:right w:w="15" w:type="dxa"/>
+              </w:tblCellMar>
+              <w:tblLook w:val="04A0" w:firstRow="1" w:lastRow="0" w:firstColumn="1" w:lastColumn="0" w:noHBand="0" w:noVBand="1"/>
+            </w:tblPr>
+            <w:tblGrid>
+              <w:gridCol w:w="714"/>
+            </w:tblGrid>
+            <w:tr>
+              <w:trPr>
+                <w:tblCellSpacing w:w="15" w:type="dxa"/>
+              </w:trPr>
+              <w:tc>
+                <w:tcPr>
+                  <w:tcW w:w="0" w:type="auto"/>
+                  <w:vAlign w:val="center"/>
+                  <w:hideMark/>
+                </w:tcPr>
+                <w:p>
+                  <w:pPr>
+                    <w:spacing w:after="120"/>
+                  </w:pPr>
+                  <w:r>
+                    <w:t>Admin</w:t>
+                  </w:r>
+                </w:p>
+              </w:tc>
+            </w:tr>
+          </w:tbl>
+          <w:p>
+            <w:pPr>
+              <w:spacing w:after="120"/>
+            </w:pPr>
+          </w:p>
+        </w:tc>
+      </w:tr>
+      <w:tr>
+        <w:tblPrEx>
+          <w:tblCellMar>
+            <w:top w:w="0" w:type="dxa"/>
+            <w:bottom w:w="0" w:type="dxa"/>
+          </w:tblCellMar>
+        </w:tblPrEx>
+        <w:trPr>
+          <w:trHeight w:val="570"/>
+        </w:trPr>
+        <w:tc>
+          <w:tcPr>
+            <w:tcW w:w="700" w:type="dxa"/>
+            <w:tcBorders>
+              <w:top w:val="single" w:sz="4" w:space="0" w:color="000000"/>
+              <w:left w:val="single" w:sz="4" w:space="0" w:color="000000"/>
+              <w:bottom w:val="single" w:sz="4" w:space="0" w:color="000000"/>
+              <w:right w:val="single" w:sz="4" w:space="0" w:color="000000"/>
+            </w:tcBorders>
+            <w:tcMar>
+              <w:top w:w="100" w:type="dxa"/>
+              <w:left w:w="120" w:type="dxa"/>
+              <w:bottom w:w="100" w:type="dxa"/>
+              <w:right w:w="120" w:type="dxa"/>
+            </w:tcMar>
+            <w:vAlign w:val="center"/>
+          </w:tcPr>
+          <w:p>
+            <w:pPr>
+              <w:spacing w:after="120"/>
+              <w:jc w:val="center"/>
+            </w:pPr>
+            <w:r>
+              <w:t>8</w:t>
+            </w:r>
+          </w:p>
+        </w:tc>
+        <w:tc>
+          <w:tcPr>
+            <w:tcW w:w="3200" w:type="dxa"/>
+            <w:tcBorders>
+              <w:top w:val="single" w:sz="4" w:space="0" w:color="000000"/>
+              <w:left w:val="single" w:sz="4" w:space="0" w:color="000000"/>
+              <w:bottom w:val="single" w:sz="4" w:space="0" w:color="000000"/>
+              <w:right w:val="single" w:sz="4" w:space="0" w:color="000000"/>
+            </w:tcBorders>
+            <w:tcMar>
+              <w:top w:w="100" w:type="dxa"/>
+              <w:left w:w="120" w:type="dxa"/>
+              <w:bottom w:w="100" w:type="dxa"/>
+              <w:right w:w="120" w:type="dxa"/>
+            </w:tcMar>
+            <w:vAlign w:val="center"/>
+          </w:tcPr>
+          <w:tbl>
+            <w:tblPr>
+              <w:tblW w:w="0" w:type="auto"/>
+              <w:tblCellSpacing w:w="15" w:type="dxa"/>
+              <w:tblCellMar>
+                <w:top w:w="15" w:type="dxa"/>
+                <w:left w:w="15" w:type="dxa"/>
+                <w:bottom w:w="15" w:type="dxa"/>
+                <w:right w:w="15" w:type="dxa"/>
+              </w:tblCellMar>
+              <w:tblLook w:val="04A0" w:firstRow="1" w:lastRow="0" w:firstColumn="1" w:lastColumn="0" w:noHBand="0" w:noVBand="1"/>
+            </w:tblPr>
+            <w:tblGrid>
+              <w:gridCol w:w="96"/>
+            </w:tblGrid>
+            <w:tr>
+              <w:trPr>
+                <w:tblCellSpacing w:w="15" w:type="dxa"/>
+              </w:trPr>
+              <w:tc>
+                <w:tcPr>
+                  <w:tcW w:w="0" w:type="auto"/>
+                  <w:vAlign w:val="center"/>
+                  <w:hideMark/>
+                </w:tcPr>
+                <w:p>
+                  <w:pPr>
+                    <w:spacing w:after="120"/>
+                  </w:pPr>
+                </w:p>
+              </w:tc>
+            </w:tr>
+          </w:tbl>
+          <w:p>
+            <w:pPr>
+              <w:spacing w:after="120"/>
+              <w:rPr>
+                <w:vanish/>
+              </w:rPr>
+            </w:pPr>
+          </w:p>
+          <w:tbl>
+            <w:tblPr>
+              <w:tblW w:w="0" w:type="auto"/>
+              <w:tblCellSpacing w:w="15" w:type="dxa"/>
+              <w:tblCellMar>
+                <w:top w:w="15" w:type="dxa"/>
+                <w:left w:w="15" w:type="dxa"/>
+                <w:bottom w:w="15" w:type="dxa"/>
+                <w:right w:w="15" w:type="dxa"/>
+              </w:tblCellMar>
+              <w:tblLook w:val="04A0" w:firstRow="1" w:lastRow="0" w:firstColumn="1" w:lastColumn="0" w:noHBand="0" w:noVBand="1"/>
+            </w:tblPr>
+            <w:tblGrid>
+              <w:gridCol w:w="763"/>
+            </w:tblGrid>
+            <w:tr>
+              <w:trPr>
+                <w:tblCellSpacing w:w="15" w:type="dxa"/>
+              </w:trPr>
+              <w:tc>
+                <w:tcPr>
+                  <w:tcW w:w="0" w:type="auto"/>
+                  <w:vAlign w:val="center"/>
+                  <w:hideMark/>
+                </w:tcPr>
+                <w:p>
+                  <w:pPr>
+                    <w:spacing w:after="120"/>
+                  </w:pPr>
+                  <w:r>
+                    <w:t>Logout</w:t>
+                  </w:r>
+                </w:p>
+              </w:tc>
+            </w:tr>
+          </w:tbl>
+          <w:p>
+            <w:pPr>
+              <w:spacing w:after="120"/>
+            </w:pPr>
+          </w:p>
+        </w:tc>
+        <w:tc>
+          <w:tcPr>
+            <w:tcW w:w="5172" w:type="dxa"/>
+            <w:tcBorders>
+              <w:top w:val="single" w:sz="4" w:space="0" w:color="000000"/>
+              <w:left w:val="single" w:sz="4" w:space="0" w:color="000000"/>
+              <w:bottom w:val="single" w:sz="4" w:space="0" w:color="000000"/>
+              <w:right w:val="single" w:sz="4" w:space="0" w:color="000000"/>
+            </w:tcBorders>
+            <w:tcMar>
+              <w:top w:w="100" w:type="dxa"/>
+              <w:left w:w="120" w:type="dxa"/>
+              <w:bottom w:w="100" w:type="dxa"/>
+              <w:right w:w="120" w:type="dxa"/>
+            </w:tcMar>
+            <w:vAlign w:val="center"/>
+          </w:tcPr>
+          <w:tbl>
+            <w:tblPr>
+              <w:tblW w:w="0" w:type="auto"/>
+              <w:tblCellSpacing w:w="15" w:type="dxa"/>
+              <w:tblCellMar>
+                <w:top w:w="15" w:type="dxa"/>
+                <w:left w:w="15" w:type="dxa"/>
+                <w:bottom w:w="15" w:type="dxa"/>
+                <w:right w:w="15" w:type="dxa"/>
+              </w:tblCellMar>
+              <w:tblLook w:val="04A0" w:firstRow="1" w:lastRow="0" w:firstColumn="1" w:lastColumn="0" w:noHBand="0" w:noVBand="1"/>
+            </w:tblPr>
+            <w:tblGrid>
+              <w:gridCol w:w="96"/>
+            </w:tblGrid>
+            <w:tr>
+              <w:trPr>
+                <w:tblCellSpacing w:w="15" w:type="dxa"/>
+              </w:trPr>
+              <w:tc>
+                <w:tcPr>
+                  <w:tcW w:w="0" w:type="auto"/>
+                  <w:vAlign w:val="center"/>
+                  <w:hideMark/>
+                </w:tcPr>
+                <w:p>
+                  <w:pPr>
+                    <w:spacing w:after="120"/>
+                  </w:pPr>
+                </w:p>
+              </w:tc>
+            </w:tr>
+          </w:tbl>
+          <w:p>
+            <w:pPr>
+              <w:spacing w:after="120"/>
+              <w:rPr>
+                <w:vanish/>
+              </w:rPr>
+            </w:pPr>
+          </w:p>
+          <w:tbl>
+            <w:tblPr>
+              <w:tblW w:w="0" w:type="auto"/>
+              <w:tblCellSpacing w:w="15" w:type="dxa"/>
+              <w:tblCellMar>
+                <w:top w:w="15" w:type="dxa"/>
+                <w:left w:w="15" w:type="dxa"/>
+                <w:bottom w:w="15" w:type="dxa"/>
+                <w:right w:w="15" w:type="dxa"/>
+              </w:tblCellMar>
+              <w:tblLook w:val="04A0" w:firstRow="1" w:lastRow="0" w:firstColumn="1" w:lastColumn="0" w:noHBand="0" w:noVBand="1"/>
+            </w:tblPr>
+            <w:tblGrid>
+              <w:gridCol w:w="1338"/>
+            </w:tblGrid>
+            <w:tr>
+              <w:trPr>
+                <w:tblCellSpacing w:w="15" w:type="dxa"/>
+              </w:trPr>
+              <w:tc>
+                <w:tcPr>
+                  <w:tcW w:w="0" w:type="auto"/>
+                  <w:vAlign w:val="center"/>
+                  <w:hideMark/>
+                </w:tcPr>
+                <w:p>
+                  <w:pPr>
+                    <w:spacing w:after="120"/>
+                  </w:pPr>
+                  <w:r>
+                    <w:t>Admin, Kasir</w:t>
+                  </w:r>
+                </w:p>
+              </w:tc>
+            </w:tr>
+          </w:tbl>
           <w:p>
             <w:pPr>
               <w:spacing w:after="120"/>
@@ -10155,7 +10840,7 @@
         <w:tblLook w:val="0000" w:firstRow="0" w:lastRow="0" w:firstColumn="0" w:lastColumn="0" w:noHBand="0" w:noVBand="0"/>
       </w:tblPr>
       <w:tblGrid>
-        <w:gridCol w:w="9072"/>
+        <w:gridCol w:w="9300"/>
       </w:tblGrid>
       <w:tr>
         <w:tblPrEx>
@@ -10252,6 +10937,59 @@
             <w:pPr>
               <w:spacing w:after="120"/>
             </w:pPr>
+            <w:r>
+              <w:rPr>
+                <w:noProof/>
+              </w:rPr>
+              <w:drawing>
+                <wp:inline distT="0" distB="0" distL="0" distR="0" wp14:anchorId="47FED1F5" wp14:editId="1C6A89F5">
+                  <wp:extent cx="5753100" cy="3829050"/>
+                  <wp:effectExtent l="0" t="0" r="0" b="0"/>
+                  <wp:docPr id="498491386" name="Gambar 2"/>
+                  <wp:cNvGraphicFramePr>
+                    <a:graphicFrameLocks xmlns:a="http://schemas.openxmlformats.org/drawingml/2006/main" noChangeAspect="1"/>
+                  </wp:cNvGraphicFramePr>
+                  <a:graphic xmlns:a="http://schemas.openxmlformats.org/drawingml/2006/main">
+                    <a:graphicData uri="http://schemas.openxmlformats.org/drawingml/2006/picture">
+                      <pic:pic xmlns:pic="http://schemas.openxmlformats.org/drawingml/2006/picture">
+                        <pic:nvPicPr>
+                          <pic:cNvPr id="0" name="Picture 2"/>
+                          <pic:cNvPicPr>
+                            <a:picLocks noChangeAspect="1" noChangeArrowheads="1"/>
+                          </pic:cNvPicPr>
+                        </pic:nvPicPr>
+                        <pic:blipFill>
+                          <a:blip r:embed="rId7" cstate="print">
+                            <a:extLst>
+                              <a:ext uri="{28A0092B-C50C-407E-A947-70E740481C1C}">
+                                <a14:useLocalDpi xmlns:a14="http://schemas.microsoft.com/office/drawing/2010/main" val="0"/>
+                              </a:ext>
+                            </a:extLst>
+                          </a:blip>
+                          <a:srcRect/>
+                          <a:stretch>
+                            <a:fillRect/>
+                          </a:stretch>
+                        </pic:blipFill>
+                        <pic:spPr bwMode="auto">
+                          <a:xfrm>
+                            <a:off x="0" y="0"/>
+                            <a:ext cx="5753100" cy="3829050"/>
+                          </a:xfrm>
+                          <a:prstGeom prst="rect">
+                            <a:avLst/>
+                          </a:prstGeom>
+                          <a:noFill/>
+                          <a:ln>
+                            <a:noFill/>
+                          </a:ln>
+                        </pic:spPr>
+                      </pic:pic>
+                    </a:graphicData>
+                  </a:graphic>
+                </wp:inline>
+              </w:drawing>
+            </w:r>
           </w:p>
           <w:p>
             <w:pPr>
@@ -10291,6 +11029,7 @@
         <w:pStyle w:val="Judul2"/>
       </w:pPr>
       <w:r>
+        <w:lastRenderedPageBreak/>
         <w:t xml:space="preserve">3.4 </w:t>
       </w:r>
       <w:proofErr w:type="spellStart"/>
@@ -10485,6 +11224,9 @@
             <w:pPr>
               <w:spacing w:after="120"/>
             </w:pPr>
+            <w:r>
+              <w:t>Login</w:t>
+            </w:r>
           </w:p>
         </w:tc>
         <w:tc>
@@ -10508,6 +11250,89 @@
             <w:pPr>
               <w:spacing w:after="120"/>
             </w:pPr>
+            <w:r>
+              <w:t xml:space="preserve">Admin dan Kasir </w:t>
+            </w:r>
+            <w:proofErr w:type="spellStart"/>
+            <w:r>
+              <w:t>memasukkan</w:t>
+            </w:r>
+            <w:proofErr w:type="spellEnd"/>
+            <w:r>
+              <w:t xml:space="preserve"> username dan password </w:t>
+            </w:r>
+            <w:proofErr w:type="spellStart"/>
+            <w:r>
+              <w:t>untuk</w:t>
+            </w:r>
+            <w:proofErr w:type="spellEnd"/>
+            <w:r>
+              <w:t xml:space="preserve"> </w:t>
+            </w:r>
+            <w:proofErr w:type="spellStart"/>
+            <w:r>
+              <w:t>masuk</w:t>
+            </w:r>
+            <w:proofErr w:type="spellEnd"/>
+            <w:r>
+              <w:t xml:space="preserve"> </w:t>
+            </w:r>
+            <w:proofErr w:type="spellStart"/>
+            <w:r>
+              <w:t>ke</w:t>
+            </w:r>
+            <w:proofErr w:type="spellEnd"/>
+            <w:r>
+              <w:t xml:space="preserve"> </w:t>
+            </w:r>
+            <w:proofErr w:type="spellStart"/>
+            <w:r>
+              <w:t>dalam</w:t>
+            </w:r>
+            <w:proofErr w:type="spellEnd"/>
+            <w:r>
+              <w:t xml:space="preserve"> </w:t>
+            </w:r>
+            <w:proofErr w:type="spellStart"/>
+            <w:r>
+              <w:t>sistem</w:t>
+            </w:r>
+            <w:proofErr w:type="spellEnd"/>
+            <w:r>
+              <w:t xml:space="preserve"> </w:t>
+            </w:r>
+            <w:proofErr w:type="spellStart"/>
+            <w:r>
+              <w:t>sesuai</w:t>
+            </w:r>
+            <w:proofErr w:type="spellEnd"/>
+            <w:r>
+              <w:t xml:space="preserve"> </w:t>
+            </w:r>
+            <w:proofErr w:type="spellStart"/>
+            <w:r>
+              <w:t>dengan</w:t>
+            </w:r>
+            <w:proofErr w:type="spellEnd"/>
+            <w:r>
+              <w:t xml:space="preserve"> </w:t>
+            </w:r>
+            <w:proofErr w:type="spellStart"/>
+            <w:r>
+              <w:t>hak</w:t>
+            </w:r>
+            <w:proofErr w:type="spellEnd"/>
+            <w:r>
+              <w:t xml:space="preserve"> </w:t>
+            </w:r>
+            <w:proofErr w:type="spellStart"/>
+            <w:r>
+              <w:t>akses</w:t>
+            </w:r>
+            <w:proofErr w:type="spellEnd"/>
+            <w:r>
+              <w:t xml:space="preserve"> masing-masing.</w:t>
+            </w:r>
           </w:p>
         </w:tc>
       </w:tr>
@@ -10566,6 +11391,19 @@
             <w:pPr>
               <w:spacing w:after="120"/>
             </w:pPr>
+            <w:proofErr w:type="spellStart"/>
+            <w:r>
+              <w:t>Mengelola</w:t>
+            </w:r>
+            <w:proofErr w:type="spellEnd"/>
+            <w:r>
+              <w:t xml:space="preserve"> </w:t>
+            </w:r>
+            <w:proofErr w:type="spellStart"/>
+            <w:r>
+              <w:t>Produk</w:t>
+            </w:r>
+            <w:proofErr w:type="spellEnd"/>
           </w:p>
         </w:tc>
         <w:tc>
@@ -10589,6 +11427,74 @@
             <w:pPr>
               <w:spacing w:after="120"/>
             </w:pPr>
+            <w:r>
+              <w:t xml:space="preserve">Admin </w:t>
+            </w:r>
+            <w:proofErr w:type="spellStart"/>
+            <w:r>
+              <w:t>dapat</w:t>
+            </w:r>
+            <w:proofErr w:type="spellEnd"/>
+            <w:r>
+              <w:t xml:space="preserve"> </w:t>
+            </w:r>
+            <w:proofErr w:type="spellStart"/>
+            <w:proofErr w:type="gramStart"/>
+            <w:r>
+              <w:t>menambah,melihat</w:t>
+            </w:r>
+            <w:proofErr w:type="gramEnd"/>
+            <w:r>
+              <w:t>,</w:t>
+            </w:r>
+            <w:proofErr w:type="gramStart"/>
+            <w:r>
+              <w:t>mengubah,dan</w:t>
+            </w:r>
+            <w:proofErr w:type="spellEnd"/>
+            <w:proofErr w:type="gramEnd"/>
+            <w:r>
+              <w:t xml:space="preserve"> </w:t>
+            </w:r>
+            <w:proofErr w:type="spellStart"/>
+            <w:proofErr w:type="gramStart"/>
+            <w:r>
+              <w:t>menghapus,data</w:t>
+            </w:r>
+            <w:proofErr w:type="spellEnd"/>
+            <w:proofErr w:type="gramEnd"/>
+            <w:r>
+              <w:t xml:space="preserve"> </w:t>
+            </w:r>
+            <w:proofErr w:type="spellStart"/>
+            <w:r>
+              <w:t>produk</w:t>
+            </w:r>
+            <w:proofErr w:type="spellEnd"/>
+            <w:r>
+              <w:t xml:space="preserve"> yang </w:t>
+            </w:r>
+            <w:proofErr w:type="spellStart"/>
+            <w:r>
+              <w:t>tersedia</w:t>
+            </w:r>
+            <w:proofErr w:type="spellEnd"/>
+            <w:r>
+              <w:t xml:space="preserve"> </w:t>
+            </w:r>
+            <w:proofErr w:type="spellStart"/>
+            <w:r>
+              <w:t>dalam</w:t>
+            </w:r>
+            <w:proofErr w:type="spellEnd"/>
+            <w:r>
+              <w:t xml:space="preserve"> </w:t>
+            </w:r>
+            <w:proofErr w:type="spellStart"/>
+            <w:r>
+              <w:t>sistem</w:t>
+            </w:r>
+            <w:proofErr w:type="spellEnd"/>
           </w:p>
         </w:tc>
       </w:tr>
@@ -10647,6 +11553,19 @@
             <w:pPr>
               <w:spacing w:after="120"/>
             </w:pPr>
+            <w:proofErr w:type="spellStart"/>
+            <w:r>
+              <w:t>Mengelola</w:t>
+            </w:r>
+            <w:proofErr w:type="spellEnd"/>
+            <w:r>
+              <w:t xml:space="preserve"> </w:t>
+            </w:r>
+            <w:proofErr w:type="spellStart"/>
+            <w:r>
+              <w:t>Pelanggan</w:t>
+            </w:r>
+            <w:proofErr w:type="spellEnd"/>
           </w:p>
         </w:tc>
         <w:tc>
@@ -10670,6 +11589,43 @@
             <w:pPr>
               <w:spacing w:after="120"/>
             </w:pPr>
+            <w:r>
+              <w:t xml:space="preserve">Admin dan Kasir </w:t>
+            </w:r>
+            <w:proofErr w:type="spellStart"/>
+            <w:r>
+              <w:t>dapat</w:t>
+            </w:r>
+            <w:proofErr w:type="spellEnd"/>
+            <w:r>
+              <w:t xml:space="preserve"> </w:t>
+            </w:r>
+            <w:proofErr w:type="spellStart"/>
+            <w:proofErr w:type="gramStart"/>
+            <w:r>
+              <w:t>menambah,melihat</w:t>
+            </w:r>
+            <w:proofErr w:type="gramEnd"/>
+            <w:r>
+              <w:t>,mengubah</w:t>
+            </w:r>
+            <w:proofErr w:type="spellEnd"/>
+            <w:r>
+              <w:t xml:space="preserve">, dan </w:t>
+            </w:r>
+            <w:proofErr w:type="spellStart"/>
+            <w:r>
+              <w:t>mencari</w:t>
+            </w:r>
+            <w:proofErr w:type="spellEnd"/>
+            <w:r>
+              <w:t xml:space="preserve"> data </w:t>
+            </w:r>
+            <w:proofErr w:type="spellStart"/>
+            <w:r>
+              <w:t>pelanggan</w:t>
+            </w:r>
+            <w:proofErr w:type="spellEnd"/>
           </w:p>
         </w:tc>
       </w:tr>
@@ -10728,6 +11684,19 @@
             <w:pPr>
               <w:spacing w:after="120"/>
             </w:pPr>
+            <w:proofErr w:type="spellStart"/>
+            <w:r>
+              <w:t>Melihat</w:t>
+            </w:r>
+            <w:proofErr w:type="spellEnd"/>
+            <w:r>
+              <w:t xml:space="preserve"> Stok </w:t>
+            </w:r>
+            <w:proofErr w:type="spellStart"/>
+            <w:r>
+              <w:t>Produk</w:t>
+            </w:r>
+            <w:proofErr w:type="spellEnd"/>
           </w:p>
         </w:tc>
         <w:tc>
@@ -10751,6 +11720,70 @@
             <w:pPr>
               <w:spacing w:after="120"/>
             </w:pPr>
+            <w:r>
+              <w:t xml:space="preserve">Admin dan Kasir </w:t>
+            </w:r>
+            <w:proofErr w:type="spellStart"/>
+            <w:r>
+              <w:t>dapat</w:t>
+            </w:r>
+            <w:proofErr w:type="spellEnd"/>
+            <w:r>
+              <w:t xml:space="preserve"> </w:t>
+            </w:r>
+            <w:proofErr w:type="spellStart"/>
+            <w:r>
+              <w:t>melihat</w:t>
+            </w:r>
+            <w:proofErr w:type="spellEnd"/>
+            <w:r>
+              <w:t xml:space="preserve"> </w:t>
+            </w:r>
+            <w:proofErr w:type="spellStart"/>
+            <w:r>
+              <w:t>jumlah</w:t>
+            </w:r>
+            <w:proofErr w:type="spellEnd"/>
+            <w:r>
+              <w:t xml:space="preserve"> </w:t>
+            </w:r>
+            <w:proofErr w:type="spellStart"/>
+            <w:r>
+              <w:t>stok</w:t>
+            </w:r>
+            <w:proofErr w:type="spellEnd"/>
+            <w:r>
+              <w:t xml:space="preserve"> </w:t>
+            </w:r>
+            <w:proofErr w:type="spellStart"/>
+            <w:r>
+              <w:t>produk</w:t>
+            </w:r>
+            <w:proofErr w:type="spellEnd"/>
+            <w:r>
+              <w:t xml:space="preserve"> yang </w:t>
+            </w:r>
+            <w:proofErr w:type="spellStart"/>
+            <w:r>
+              <w:t>tersedia</w:t>
+            </w:r>
+            <w:proofErr w:type="spellEnd"/>
+            <w:r>
+              <w:t xml:space="preserve"> di </w:t>
+            </w:r>
+            <w:proofErr w:type="spellStart"/>
+            <w:r>
+              <w:t>dalam</w:t>
+            </w:r>
+            <w:proofErr w:type="spellEnd"/>
+            <w:r>
+              <w:t xml:space="preserve"> </w:t>
+            </w:r>
+            <w:proofErr w:type="spellStart"/>
+            <w:r>
+              <w:t>sistem</w:t>
+            </w:r>
+            <w:proofErr w:type="spellEnd"/>
           </w:p>
         </w:tc>
       </w:tr>
@@ -10809,6 +11842,27 @@
             <w:pPr>
               <w:spacing w:after="120"/>
             </w:pPr>
+            <w:proofErr w:type="spellStart"/>
+            <w:r>
+              <w:t>Melakukan</w:t>
+            </w:r>
+            <w:proofErr w:type="spellEnd"/>
+            <w:r>
+              <w:t xml:space="preserve"> </w:t>
+            </w:r>
+            <w:proofErr w:type="spellStart"/>
+            <w:r>
+              <w:t>Transaksi</w:t>
+            </w:r>
+            <w:proofErr w:type="spellEnd"/>
+            <w:r>
+              <w:t xml:space="preserve"> </w:t>
+            </w:r>
+            <w:proofErr w:type="spellStart"/>
+            <w:r>
+              <w:t>Penjualan</w:t>
+            </w:r>
+            <w:proofErr w:type="spellEnd"/>
           </w:p>
         </w:tc>
         <w:tc>
@@ -10832,6 +11886,569 @@
             <w:pPr>
               <w:spacing w:after="120"/>
             </w:pPr>
+            <w:r>
+              <w:t xml:space="preserve">Kasir </w:t>
+            </w:r>
+            <w:proofErr w:type="spellStart"/>
+            <w:r>
+              <w:t>memilih</w:t>
+            </w:r>
+            <w:proofErr w:type="spellEnd"/>
+            <w:r>
+              <w:t xml:space="preserve"> </w:t>
+            </w:r>
+            <w:proofErr w:type="spellStart"/>
+            <w:r>
+              <w:t>produk</w:t>
+            </w:r>
+            <w:proofErr w:type="spellEnd"/>
+            <w:r>
+              <w:t xml:space="preserve"> dan </w:t>
+            </w:r>
+            <w:proofErr w:type="spellStart"/>
+            <w:r>
+              <w:t>jumlah</w:t>
+            </w:r>
+            <w:proofErr w:type="spellEnd"/>
+            <w:r>
+              <w:t xml:space="preserve"> </w:t>
+            </w:r>
+            <w:proofErr w:type="spellStart"/>
+            <w:r>
+              <w:t>pembelian</w:t>
+            </w:r>
+            <w:proofErr w:type="spellEnd"/>
+            <w:r>
+              <w:t xml:space="preserve">, </w:t>
+            </w:r>
+            <w:proofErr w:type="spellStart"/>
+            <w:r>
+              <w:t>kemudian</w:t>
+            </w:r>
+            <w:proofErr w:type="spellEnd"/>
+            <w:r>
+              <w:t xml:space="preserve"> </w:t>
+            </w:r>
+            <w:proofErr w:type="spellStart"/>
+            <w:r>
+              <w:t>sistem</w:t>
+            </w:r>
+            <w:proofErr w:type="spellEnd"/>
+            <w:r>
+              <w:t xml:space="preserve"> </w:t>
+            </w:r>
+            <w:proofErr w:type="spellStart"/>
+            <w:r>
+              <w:t>menghitung</w:t>
+            </w:r>
+            <w:proofErr w:type="spellEnd"/>
+            <w:r>
+              <w:t xml:space="preserve"> total </w:t>
+            </w:r>
+            <w:proofErr w:type="spellStart"/>
+            <w:r>
+              <w:t>transaksi</w:t>
+            </w:r>
+            <w:proofErr w:type="spellEnd"/>
+            <w:r>
+              <w:t xml:space="preserve"> dan </w:t>
+            </w:r>
+            <w:proofErr w:type="spellStart"/>
+            <w:r>
+              <w:t>mengurangi</w:t>
+            </w:r>
+            <w:proofErr w:type="spellEnd"/>
+            <w:r>
+              <w:t xml:space="preserve"> </w:t>
+            </w:r>
+            <w:proofErr w:type="spellStart"/>
+            <w:r>
+              <w:t>stok</w:t>
+            </w:r>
+            <w:proofErr w:type="spellEnd"/>
+            <w:r>
+              <w:t xml:space="preserve"> </w:t>
+            </w:r>
+            <w:proofErr w:type="spellStart"/>
+            <w:r>
+              <w:t>produk</w:t>
+            </w:r>
+            <w:proofErr w:type="spellEnd"/>
+            <w:r>
+              <w:t>.</w:t>
+            </w:r>
+          </w:p>
+        </w:tc>
+      </w:tr>
+      <w:tr>
+        <w:tblPrEx>
+          <w:tblCellMar>
+            <w:top w:w="0" w:type="dxa"/>
+            <w:bottom w:w="0" w:type="dxa"/>
+          </w:tblCellMar>
+        </w:tblPrEx>
+        <w:tc>
+          <w:tcPr>
+            <w:tcW w:w="700" w:type="dxa"/>
+            <w:tcBorders>
+              <w:top w:val="single" w:sz="4" w:space="0" w:color="000000"/>
+              <w:left w:val="single" w:sz="4" w:space="0" w:color="000000"/>
+              <w:bottom w:val="single" w:sz="4" w:space="0" w:color="000000"/>
+              <w:right w:val="single" w:sz="4" w:space="0" w:color="000000"/>
+            </w:tcBorders>
+            <w:tcMar>
+              <w:top w:w="100" w:type="dxa"/>
+              <w:left w:w="120" w:type="dxa"/>
+              <w:bottom w:w="100" w:type="dxa"/>
+              <w:right w:w="120" w:type="dxa"/>
+            </w:tcMar>
+            <w:vAlign w:val="center"/>
+          </w:tcPr>
+          <w:p>
+            <w:pPr>
+              <w:spacing w:after="120"/>
+              <w:jc w:val="center"/>
+            </w:pPr>
+            <w:r>
+              <w:t>6</w:t>
+            </w:r>
+          </w:p>
+        </w:tc>
+        <w:tc>
+          <w:tcPr>
+            <w:tcW w:w="2500" w:type="dxa"/>
+            <w:tcBorders>
+              <w:top w:val="single" w:sz="4" w:space="0" w:color="000000"/>
+              <w:left w:val="single" w:sz="4" w:space="0" w:color="000000"/>
+              <w:bottom w:val="single" w:sz="4" w:space="0" w:color="000000"/>
+              <w:right w:val="single" w:sz="4" w:space="0" w:color="000000"/>
+            </w:tcBorders>
+            <w:tcMar>
+              <w:top w:w="100" w:type="dxa"/>
+              <w:left w:w="120" w:type="dxa"/>
+              <w:bottom w:w="100" w:type="dxa"/>
+              <w:right w:w="120" w:type="dxa"/>
+            </w:tcMar>
+            <w:vAlign w:val="center"/>
+          </w:tcPr>
+          <w:p>
+            <w:pPr>
+              <w:spacing w:after="120"/>
+            </w:pPr>
+            <w:proofErr w:type="spellStart"/>
+            <w:r>
+              <w:t>Melihat</w:t>
+            </w:r>
+            <w:proofErr w:type="spellEnd"/>
+            <w:r>
+              <w:t xml:space="preserve"> Riwayat </w:t>
+            </w:r>
+            <w:proofErr w:type="spellStart"/>
+            <w:r>
+              <w:t>Transaksi</w:t>
+            </w:r>
+            <w:proofErr w:type="spellEnd"/>
+          </w:p>
+        </w:tc>
+        <w:tc>
+          <w:tcPr>
+            <w:tcW w:w="5872" w:type="dxa"/>
+            <w:tcBorders>
+              <w:top w:val="single" w:sz="4" w:space="0" w:color="000000"/>
+              <w:left w:val="single" w:sz="4" w:space="0" w:color="000000"/>
+              <w:bottom w:val="single" w:sz="4" w:space="0" w:color="000000"/>
+              <w:right w:val="single" w:sz="4" w:space="0" w:color="000000"/>
+            </w:tcBorders>
+            <w:tcMar>
+              <w:top w:w="100" w:type="dxa"/>
+              <w:left w:w="120" w:type="dxa"/>
+              <w:bottom w:w="100" w:type="dxa"/>
+              <w:right w:w="120" w:type="dxa"/>
+            </w:tcMar>
+            <w:vAlign w:val="center"/>
+          </w:tcPr>
+          <w:p>
+            <w:pPr>
+              <w:spacing w:after="120"/>
+            </w:pPr>
+            <w:r>
+              <w:t xml:space="preserve">Admin dan Kasir </w:t>
+            </w:r>
+            <w:proofErr w:type="spellStart"/>
+            <w:r>
+              <w:t>dapat</w:t>
+            </w:r>
+            <w:proofErr w:type="spellEnd"/>
+            <w:r>
+              <w:t xml:space="preserve"> </w:t>
+            </w:r>
+            <w:proofErr w:type="spellStart"/>
+            <w:r>
+              <w:t>melihat</w:t>
+            </w:r>
+            <w:proofErr w:type="spellEnd"/>
+            <w:r>
+              <w:t xml:space="preserve"> daftar </w:t>
+            </w:r>
+            <w:proofErr w:type="spellStart"/>
+            <w:r>
+              <w:t>transaksi</w:t>
+            </w:r>
+            <w:proofErr w:type="spellEnd"/>
+            <w:r>
+              <w:t xml:space="preserve"> </w:t>
+            </w:r>
+            <w:proofErr w:type="spellStart"/>
+            <w:r>
+              <w:t>penjualan</w:t>
+            </w:r>
+            <w:proofErr w:type="spellEnd"/>
+            <w:r>
+              <w:t xml:space="preserve"> yang </w:t>
+            </w:r>
+            <w:proofErr w:type="spellStart"/>
+            <w:r>
+              <w:t>telah</w:t>
+            </w:r>
+            <w:proofErr w:type="spellEnd"/>
+            <w:r>
+              <w:t xml:space="preserve"> </w:t>
+            </w:r>
+            <w:proofErr w:type="spellStart"/>
+            <w:r>
+              <w:t>dilakukan</w:t>
+            </w:r>
+            <w:proofErr w:type="spellEnd"/>
+          </w:p>
+        </w:tc>
+      </w:tr>
+      <w:tr>
+        <w:tblPrEx>
+          <w:tblCellMar>
+            <w:top w:w="0" w:type="dxa"/>
+            <w:bottom w:w="0" w:type="dxa"/>
+          </w:tblCellMar>
+        </w:tblPrEx>
+        <w:tc>
+          <w:tcPr>
+            <w:tcW w:w="700" w:type="dxa"/>
+            <w:tcBorders>
+              <w:top w:val="single" w:sz="4" w:space="0" w:color="000000"/>
+              <w:left w:val="single" w:sz="4" w:space="0" w:color="000000"/>
+              <w:bottom w:val="single" w:sz="4" w:space="0" w:color="000000"/>
+              <w:right w:val="single" w:sz="4" w:space="0" w:color="000000"/>
+            </w:tcBorders>
+            <w:tcMar>
+              <w:top w:w="100" w:type="dxa"/>
+              <w:left w:w="120" w:type="dxa"/>
+              <w:bottom w:w="100" w:type="dxa"/>
+              <w:right w:w="120" w:type="dxa"/>
+            </w:tcMar>
+            <w:vAlign w:val="center"/>
+          </w:tcPr>
+          <w:p>
+            <w:pPr>
+              <w:spacing w:after="120"/>
+              <w:jc w:val="center"/>
+            </w:pPr>
+            <w:r>
+              <w:t>7</w:t>
+            </w:r>
+          </w:p>
+        </w:tc>
+        <w:tc>
+          <w:tcPr>
+            <w:tcW w:w="2500" w:type="dxa"/>
+            <w:tcBorders>
+              <w:top w:val="single" w:sz="4" w:space="0" w:color="000000"/>
+              <w:left w:val="single" w:sz="4" w:space="0" w:color="000000"/>
+              <w:bottom w:val="single" w:sz="4" w:space="0" w:color="000000"/>
+              <w:right w:val="single" w:sz="4" w:space="0" w:color="000000"/>
+            </w:tcBorders>
+            <w:tcMar>
+              <w:top w:w="100" w:type="dxa"/>
+              <w:left w:w="120" w:type="dxa"/>
+              <w:bottom w:w="100" w:type="dxa"/>
+              <w:right w:w="120" w:type="dxa"/>
+            </w:tcMar>
+            <w:vAlign w:val="center"/>
+          </w:tcPr>
+          <w:p>
+            <w:pPr>
+              <w:spacing w:after="120"/>
+            </w:pPr>
+            <w:proofErr w:type="spellStart"/>
+            <w:r>
+              <w:t>Melihat</w:t>
+            </w:r>
+            <w:proofErr w:type="spellEnd"/>
+            <w:r>
+              <w:t xml:space="preserve"> </w:t>
+            </w:r>
+            <w:proofErr w:type="spellStart"/>
+            <w:proofErr w:type="gramStart"/>
+            <w:r>
+              <w:t>Laporan</w:t>
+            </w:r>
+            <w:proofErr w:type="spellEnd"/>
+            <w:r>
+              <w:t xml:space="preserve">  </w:t>
+            </w:r>
+            <w:proofErr w:type="spellStart"/>
+            <w:r>
+              <w:t>Penjualan</w:t>
+            </w:r>
+            <w:proofErr w:type="spellEnd"/>
+            <w:proofErr w:type="gramEnd"/>
+          </w:p>
+        </w:tc>
+        <w:tc>
+          <w:tcPr>
+            <w:tcW w:w="5872" w:type="dxa"/>
+            <w:tcBorders>
+              <w:top w:val="single" w:sz="4" w:space="0" w:color="000000"/>
+              <w:left w:val="single" w:sz="4" w:space="0" w:color="000000"/>
+              <w:bottom w:val="single" w:sz="4" w:space="0" w:color="000000"/>
+              <w:right w:val="single" w:sz="4" w:space="0" w:color="000000"/>
+            </w:tcBorders>
+            <w:tcMar>
+              <w:top w:w="100" w:type="dxa"/>
+              <w:left w:w="120" w:type="dxa"/>
+              <w:bottom w:w="100" w:type="dxa"/>
+              <w:right w:w="120" w:type="dxa"/>
+            </w:tcMar>
+            <w:vAlign w:val="center"/>
+          </w:tcPr>
+          <w:p>
+            <w:pPr>
+              <w:spacing w:after="120"/>
+            </w:pPr>
+            <w:r>
+              <w:t xml:space="preserve">Admin </w:t>
+            </w:r>
+            <w:proofErr w:type="spellStart"/>
+            <w:r>
+              <w:t>dapat</w:t>
+            </w:r>
+            <w:proofErr w:type="spellEnd"/>
+            <w:r>
+              <w:t xml:space="preserve"> </w:t>
+            </w:r>
+            <w:proofErr w:type="spellStart"/>
+            <w:r>
+              <w:t>melihat</w:t>
+            </w:r>
+            <w:proofErr w:type="spellEnd"/>
+            <w:r>
+              <w:t xml:space="preserve"> </w:t>
+            </w:r>
+            <w:proofErr w:type="spellStart"/>
+            <w:r>
+              <w:t>laporan</w:t>
+            </w:r>
+            <w:proofErr w:type="spellEnd"/>
+            <w:r>
+              <w:t xml:space="preserve"> </w:t>
+            </w:r>
+            <w:proofErr w:type="spellStart"/>
+            <w:r>
+              <w:t>penjualan</w:t>
+            </w:r>
+            <w:proofErr w:type="spellEnd"/>
+            <w:r>
+              <w:t xml:space="preserve"> </w:t>
+            </w:r>
+            <w:proofErr w:type="spellStart"/>
+            <w:r>
+              <w:t>berdasarkan</w:t>
+            </w:r>
+            <w:proofErr w:type="spellEnd"/>
+            <w:r>
+              <w:t xml:space="preserve"> data </w:t>
+            </w:r>
+            <w:proofErr w:type="spellStart"/>
+            <w:r>
+              <w:t>transaksi</w:t>
+            </w:r>
+            <w:proofErr w:type="spellEnd"/>
+            <w:r>
+              <w:t xml:space="preserve"> yang </w:t>
+            </w:r>
+            <w:proofErr w:type="spellStart"/>
+            <w:r>
+              <w:t>tersimpan</w:t>
+            </w:r>
+            <w:proofErr w:type="spellEnd"/>
+            <w:r>
+              <w:t xml:space="preserve"> </w:t>
+            </w:r>
+            <w:proofErr w:type="spellStart"/>
+            <w:r>
+              <w:t>dalam</w:t>
+            </w:r>
+            <w:proofErr w:type="spellEnd"/>
+            <w:r>
+              <w:t xml:space="preserve"> </w:t>
+            </w:r>
+            <w:proofErr w:type="spellStart"/>
+            <w:r>
+              <w:t>sistem</w:t>
+            </w:r>
+            <w:proofErr w:type="spellEnd"/>
+            <w:r>
+              <w:t>.</w:t>
+            </w:r>
+          </w:p>
+        </w:tc>
+      </w:tr>
+      <w:tr>
+        <w:tblPrEx>
+          <w:tblCellMar>
+            <w:top w:w="0" w:type="dxa"/>
+            <w:bottom w:w="0" w:type="dxa"/>
+          </w:tblCellMar>
+        </w:tblPrEx>
+        <w:tc>
+          <w:tcPr>
+            <w:tcW w:w="700" w:type="dxa"/>
+            <w:tcBorders>
+              <w:top w:val="single" w:sz="4" w:space="0" w:color="000000"/>
+              <w:left w:val="single" w:sz="4" w:space="0" w:color="000000"/>
+              <w:bottom w:val="single" w:sz="4" w:space="0" w:color="000000"/>
+              <w:right w:val="single" w:sz="4" w:space="0" w:color="000000"/>
+            </w:tcBorders>
+            <w:tcMar>
+              <w:top w:w="100" w:type="dxa"/>
+              <w:left w:w="120" w:type="dxa"/>
+              <w:bottom w:w="100" w:type="dxa"/>
+              <w:right w:w="120" w:type="dxa"/>
+            </w:tcMar>
+            <w:vAlign w:val="center"/>
+          </w:tcPr>
+          <w:p>
+            <w:pPr>
+              <w:spacing w:after="120"/>
+              <w:jc w:val="center"/>
+            </w:pPr>
+            <w:r>
+              <w:t>8</w:t>
+            </w:r>
+          </w:p>
+        </w:tc>
+        <w:tc>
+          <w:tcPr>
+            <w:tcW w:w="2500" w:type="dxa"/>
+            <w:tcBorders>
+              <w:top w:val="single" w:sz="4" w:space="0" w:color="000000"/>
+              <w:left w:val="single" w:sz="4" w:space="0" w:color="000000"/>
+              <w:bottom w:val="single" w:sz="4" w:space="0" w:color="000000"/>
+              <w:right w:val="single" w:sz="4" w:space="0" w:color="000000"/>
+            </w:tcBorders>
+            <w:tcMar>
+              <w:top w:w="100" w:type="dxa"/>
+              <w:left w:w="120" w:type="dxa"/>
+              <w:bottom w:w="100" w:type="dxa"/>
+              <w:right w:w="120" w:type="dxa"/>
+            </w:tcMar>
+            <w:vAlign w:val="center"/>
+          </w:tcPr>
+          <w:p>
+            <w:pPr>
+              <w:spacing w:after="120"/>
+            </w:pPr>
+            <w:r>
+              <w:t>Logout</w:t>
+            </w:r>
+          </w:p>
+        </w:tc>
+        <w:tc>
+          <w:tcPr>
+            <w:tcW w:w="5872" w:type="dxa"/>
+            <w:tcBorders>
+              <w:top w:val="single" w:sz="4" w:space="0" w:color="000000"/>
+              <w:left w:val="single" w:sz="4" w:space="0" w:color="000000"/>
+              <w:bottom w:val="single" w:sz="4" w:space="0" w:color="000000"/>
+              <w:right w:val="single" w:sz="4" w:space="0" w:color="000000"/>
+            </w:tcBorders>
+            <w:tcMar>
+              <w:top w:w="100" w:type="dxa"/>
+              <w:left w:w="120" w:type="dxa"/>
+              <w:bottom w:w="100" w:type="dxa"/>
+              <w:right w:w="120" w:type="dxa"/>
+            </w:tcMar>
+            <w:vAlign w:val="center"/>
+          </w:tcPr>
+          <w:p>
+            <w:pPr>
+              <w:spacing w:after="120"/>
+            </w:pPr>
+            <w:r>
+              <w:t xml:space="preserve">Admin dan Kasir </w:t>
+            </w:r>
+            <w:proofErr w:type="spellStart"/>
+            <w:r>
+              <w:t>dapat</w:t>
+            </w:r>
+            <w:proofErr w:type="spellEnd"/>
+            <w:r>
+              <w:t xml:space="preserve"> </w:t>
+            </w:r>
+            <w:proofErr w:type="spellStart"/>
+            <w:r>
+              <w:t>keluar</w:t>
+            </w:r>
+            <w:proofErr w:type="spellEnd"/>
+            <w:r>
+              <w:t xml:space="preserve"> </w:t>
+            </w:r>
+            <w:proofErr w:type="spellStart"/>
+            <w:r>
+              <w:t>dari</w:t>
+            </w:r>
+            <w:proofErr w:type="spellEnd"/>
+            <w:r>
+              <w:t xml:space="preserve"> system </w:t>
+            </w:r>
+            <w:proofErr w:type="spellStart"/>
+            <w:r>
+              <w:t>untuk</w:t>
+            </w:r>
+            <w:proofErr w:type="spellEnd"/>
+            <w:r>
+              <w:t xml:space="preserve"> </w:t>
+            </w:r>
+            <w:proofErr w:type="spellStart"/>
+            <w:r>
+              <w:t>mengakhiri</w:t>
+            </w:r>
+            <w:proofErr w:type="spellEnd"/>
+            <w:r>
+              <w:t xml:space="preserve"> </w:t>
+            </w:r>
+            <w:proofErr w:type="spellStart"/>
+            <w:r>
+              <w:t>sesi</w:t>
+            </w:r>
+            <w:proofErr w:type="spellEnd"/>
+            <w:r>
+              <w:t xml:space="preserve"> </w:t>
+            </w:r>
+            <w:proofErr w:type="spellStart"/>
+            <w:r>
+              <w:t>penggunaan</w:t>
+            </w:r>
+            <w:proofErr w:type="spellEnd"/>
+            <w:r>
+              <w:t xml:space="preserve"> </w:t>
+            </w:r>
+            <w:proofErr w:type="spellStart"/>
+            <w:r>
+              <w:t>aplikasi</w:t>
+            </w:r>
+            <w:proofErr w:type="spellEnd"/>
+            <w:r>
+              <w:t>.</w:t>
+            </w:r>
           </w:p>
         </w:tc>
       </w:tr>
@@ -11106,17 +12723,91 @@
           <w:p>
             <w:pPr>
               <w:spacing w:after="60"/>
-            </w:pPr>
-            <w:r>
-              <w:t xml:space="preserve">[Isi </w:t>
-            </w:r>
-            <w:proofErr w:type="spellStart"/>
-            <w:r>
-              <w:t>Penjelasan</w:t>
-            </w:r>
-            <w:proofErr w:type="spellEnd"/>
-            <w:r>
-              <w:t xml:space="preserve"> Alur Proses </w:t>
+              <w:rPr>
+                <w:b/>
+                <w:bCs/>
+              </w:rPr>
+            </w:pPr>
+            <w:r>
+              <w:t>[</w:t>
+            </w:r>
+            <w:r>
+              <w:t xml:space="preserve"> </w:t>
+            </w:r>
+            <w:r>
+              <w:t xml:space="preserve">Alur </w:t>
+            </w:r>
+            <w:proofErr w:type="spellStart"/>
+            <w:r>
+              <w:t>sistem</w:t>
+            </w:r>
+            <w:proofErr w:type="spellEnd"/>
+            <w:r>
+              <w:t xml:space="preserve"> </w:t>
+            </w:r>
+            <w:proofErr w:type="spellStart"/>
+            <w:r>
+              <w:t>SellManage</w:t>
+            </w:r>
+            <w:proofErr w:type="spellEnd"/>
+            <w:r>
+              <w:t xml:space="preserve"> </w:t>
+            </w:r>
+            <w:proofErr w:type="spellStart"/>
+            <w:r>
+              <w:t>dimulai</w:t>
+            </w:r>
+            <w:proofErr w:type="spellEnd"/>
+            <w:r>
+              <w:t xml:space="preserve"> </w:t>
+            </w:r>
+            <w:proofErr w:type="spellStart"/>
+            <w:r>
+              <w:t>ketika</w:t>
+            </w:r>
+            <w:proofErr w:type="spellEnd"/>
+            <w:r>
+              <w:t xml:space="preserve"> </w:t>
+            </w:r>
+            <w:proofErr w:type="spellStart"/>
+            <w:r>
+              <w:t>pengguna</w:t>
+            </w:r>
+            <w:proofErr w:type="spellEnd"/>
+            <w:r>
+              <w:t xml:space="preserve"> </w:t>
+            </w:r>
+            <w:proofErr w:type="spellStart"/>
+            <w:r>
+              <w:t>membuka</w:t>
+            </w:r>
+            <w:proofErr w:type="spellEnd"/>
+            <w:r>
+              <w:t xml:space="preserve"> </w:t>
+            </w:r>
+            <w:proofErr w:type="spellStart"/>
+            <w:r>
+              <w:t>halaman</w:t>
+            </w:r>
+            <w:proofErr w:type="spellEnd"/>
+            <w:r>
+              <w:t xml:space="preserve"> login dan </w:t>
+            </w:r>
+            <w:proofErr w:type="spellStart"/>
+            <w:r>
+              <w:t>memasukkan</w:t>
+            </w:r>
+            <w:proofErr w:type="spellEnd"/>
+            <w:r>
+              <w:t xml:space="preserve"> username </w:t>
+            </w:r>
+            <w:proofErr w:type="spellStart"/>
+            <w:r>
+              <w:t>serta</w:t>
+            </w:r>
+            <w:proofErr w:type="spellEnd"/>
+            <w:r>
+              <w:t xml:space="preserve"> password. </w:t>
             </w:r>
             <w:proofErr w:type="spellStart"/>
             <w:r>
@@ -11124,8 +12815,557 @@
             </w:r>
             <w:proofErr w:type="spellEnd"/>
             <w:r>
+              <w:t xml:space="preserve"> </w:t>
+            </w:r>
+            <w:proofErr w:type="spellStart"/>
+            <w:r>
+              <w:t>melakukan</w:t>
+            </w:r>
+            <w:proofErr w:type="spellEnd"/>
+            <w:r>
+              <w:t xml:space="preserve"> </w:t>
+            </w:r>
+            <w:proofErr w:type="spellStart"/>
+            <w:r>
+              <w:t>validasi</w:t>
+            </w:r>
+            <w:proofErr w:type="spellEnd"/>
+            <w:r>
+              <w:t xml:space="preserve"> data </w:t>
+            </w:r>
+            <w:proofErr w:type="spellStart"/>
+            <w:r>
+              <w:t>pengguna</w:t>
+            </w:r>
+            <w:proofErr w:type="spellEnd"/>
+            <w:r>
+              <w:t xml:space="preserve"> dan </w:t>
+            </w:r>
+            <w:proofErr w:type="spellStart"/>
+            <w:r>
+              <w:t>mengarahkan</w:t>
+            </w:r>
+            <w:proofErr w:type="spellEnd"/>
+            <w:r>
+              <w:t xml:space="preserve"> </w:t>
+            </w:r>
+            <w:proofErr w:type="spellStart"/>
+            <w:r>
+              <w:t>pengguna</w:t>
+            </w:r>
+            <w:proofErr w:type="spellEnd"/>
+            <w:r>
+              <w:t xml:space="preserve"> </w:t>
+            </w:r>
+            <w:proofErr w:type="spellStart"/>
+            <w:r>
+              <w:t>ke</w:t>
+            </w:r>
+            <w:proofErr w:type="spellEnd"/>
+            <w:r>
+              <w:t xml:space="preserve"> </w:t>
+            </w:r>
+            <w:proofErr w:type="spellStart"/>
+            <w:r>
+              <w:t>halaman</w:t>
+            </w:r>
+            <w:proofErr w:type="spellEnd"/>
+            <w:r>
+              <w:t xml:space="preserve"> dashboard </w:t>
+            </w:r>
+            <w:proofErr w:type="spellStart"/>
+            <w:r>
+              <w:t>sesuai</w:t>
+            </w:r>
+            <w:proofErr w:type="spellEnd"/>
+            <w:r>
+              <w:t xml:space="preserve"> </w:t>
+            </w:r>
+            <w:proofErr w:type="spellStart"/>
+            <w:r>
+              <w:t>dengan</w:t>
+            </w:r>
+            <w:proofErr w:type="spellEnd"/>
+            <w:r>
+              <w:t xml:space="preserve"> </w:t>
+            </w:r>
+            <w:proofErr w:type="spellStart"/>
+            <w:r>
+              <w:t>hak</w:t>
+            </w:r>
+            <w:proofErr w:type="spellEnd"/>
+            <w:r>
+              <w:t xml:space="preserve"> </w:t>
+            </w:r>
+            <w:proofErr w:type="spellStart"/>
+            <w:r>
+              <w:t>aksesnya</w:t>
+            </w:r>
+            <w:proofErr w:type="spellEnd"/>
+            <w:r>
+              <w:t>.</w:t>
+            </w:r>
+          </w:p>
+          <w:p>
+            <w:pPr>
+              <w:spacing w:after="60"/>
+            </w:pPr>
+            <w:r>
+              <w:t xml:space="preserve">Admin </w:t>
+            </w:r>
+            <w:proofErr w:type="spellStart"/>
+            <w:r>
+              <w:t>dapat</w:t>
+            </w:r>
+            <w:proofErr w:type="spellEnd"/>
+            <w:r>
+              <w:t xml:space="preserve"> </w:t>
+            </w:r>
+            <w:proofErr w:type="spellStart"/>
+            <w:r>
+              <w:t>mengelola</w:t>
+            </w:r>
+            <w:proofErr w:type="spellEnd"/>
+            <w:r>
+              <w:t xml:space="preserve"> data </w:t>
+            </w:r>
+            <w:proofErr w:type="spellStart"/>
+            <w:r>
+              <w:t>produk</w:t>
+            </w:r>
+            <w:proofErr w:type="spellEnd"/>
+            <w:r>
+              <w:t xml:space="preserve">, </w:t>
+            </w:r>
+            <w:proofErr w:type="spellStart"/>
+            <w:r>
+              <w:t>pelanggan</w:t>
+            </w:r>
+            <w:proofErr w:type="spellEnd"/>
+            <w:r>
+              <w:t xml:space="preserve">, dan </w:t>
+            </w:r>
+            <w:proofErr w:type="spellStart"/>
+            <w:r>
+              <w:t>melihat</w:t>
+            </w:r>
+            <w:proofErr w:type="spellEnd"/>
+            <w:r>
+              <w:t xml:space="preserve"> </w:t>
+            </w:r>
+            <w:proofErr w:type="spellStart"/>
+            <w:r>
+              <w:t>stok</w:t>
+            </w:r>
+            <w:proofErr w:type="spellEnd"/>
+            <w:r>
+              <w:t xml:space="preserve"> </w:t>
+            </w:r>
+            <w:proofErr w:type="spellStart"/>
+            <w:r>
+              <w:t>serta</w:t>
+            </w:r>
+            <w:proofErr w:type="spellEnd"/>
+            <w:r>
+              <w:t xml:space="preserve"> </w:t>
+            </w:r>
+            <w:proofErr w:type="spellStart"/>
+            <w:r>
+              <w:t>laporan</w:t>
+            </w:r>
+            <w:proofErr w:type="spellEnd"/>
+            <w:r>
+              <w:t xml:space="preserve"> </w:t>
+            </w:r>
+            <w:proofErr w:type="spellStart"/>
+            <w:r>
+              <w:t>penjualan</w:t>
+            </w:r>
+            <w:proofErr w:type="spellEnd"/>
+            <w:r>
+              <w:t xml:space="preserve">. Kasir </w:t>
+            </w:r>
+            <w:proofErr w:type="spellStart"/>
+            <w:r>
+              <w:t>dapat</w:t>
+            </w:r>
+            <w:proofErr w:type="spellEnd"/>
+            <w:r>
+              <w:t xml:space="preserve"> </w:t>
+            </w:r>
+            <w:proofErr w:type="spellStart"/>
+            <w:r>
+              <w:t>melihat</w:t>
+            </w:r>
+            <w:proofErr w:type="spellEnd"/>
+            <w:r>
+              <w:t xml:space="preserve"> data </w:t>
+            </w:r>
+            <w:proofErr w:type="spellStart"/>
+            <w:r>
+              <w:t>produk</w:t>
+            </w:r>
+            <w:proofErr w:type="spellEnd"/>
+            <w:r>
+              <w:t xml:space="preserve"> dan </w:t>
+            </w:r>
+            <w:proofErr w:type="spellStart"/>
+            <w:r>
+              <w:t>stok</w:t>
+            </w:r>
+            <w:proofErr w:type="spellEnd"/>
+            <w:r>
+              <w:t xml:space="preserve">, </w:t>
+            </w:r>
+            <w:proofErr w:type="spellStart"/>
+            <w:r>
+              <w:t>mengelola</w:t>
+            </w:r>
+            <w:proofErr w:type="spellEnd"/>
+            <w:r>
+              <w:t xml:space="preserve"> data </w:t>
+            </w:r>
+            <w:proofErr w:type="spellStart"/>
+            <w:r>
+              <w:t>pelanggan</w:t>
+            </w:r>
+            <w:proofErr w:type="spellEnd"/>
+            <w:r>
+              <w:t xml:space="preserve">, </w:t>
+            </w:r>
+            <w:proofErr w:type="spellStart"/>
+            <w:r>
+              <w:t>serta</w:t>
+            </w:r>
+            <w:proofErr w:type="spellEnd"/>
+            <w:r>
+              <w:t xml:space="preserve"> </w:t>
+            </w:r>
+            <w:proofErr w:type="spellStart"/>
+            <w:r>
+              <w:t>melakukan</w:t>
+            </w:r>
+            <w:proofErr w:type="spellEnd"/>
+            <w:r>
+              <w:t xml:space="preserve"> </w:t>
+            </w:r>
+            <w:proofErr w:type="spellStart"/>
+            <w:r>
+              <w:t>transaksi</w:t>
+            </w:r>
+            <w:proofErr w:type="spellEnd"/>
+            <w:r>
+              <w:t xml:space="preserve"> </w:t>
+            </w:r>
+            <w:proofErr w:type="spellStart"/>
+            <w:r>
+              <w:t>penjualan</w:t>
+            </w:r>
+            <w:proofErr w:type="spellEnd"/>
+            <w:r>
+              <w:t>.</w:t>
+            </w:r>
+          </w:p>
+          <w:p>
+            <w:pPr>
+              <w:spacing w:after="60"/>
+            </w:pPr>
+            <w:r>
+              <w:t xml:space="preserve">Pada proses </w:t>
+            </w:r>
+            <w:proofErr w:type="spellStart"/>
+            <w:r>
+              <w:t>transaksi</w:t>
+            </w:r>
+            <w:proofErr w:type="spellEnd"/>
+            <w:r>
+              <w:t xml:space="preserve">, Kasir </w:t>
+            </w:r>
+            <w:proofErr w:type="spellStart"/>
+            <w:r>
+              <w:t>memilih</w:t>
+            </w:r>
+            <w:proofErr w:type="spellEnd"/>
+            <w:r>
+              <w:t xml:space="preserve"> </w:t>
+            </w:r>
+            <w:proofErr w:type="spellStart"/>
+            <w:r>
+              <w:t>produk</w:t>
+            </w:r>
+            <w:proofErr w:type="spellEnd"/>
+            <w:r>
+              <w:t xml:space="preserve"> dan </w:t>
+            </w:r>
+            <w:proofErr w:type="spellStart"/>
+            <w:r>
+              <w:t>jumlah</w:t>
+            </w:r>
+            <w:proofErr w:type="spellEnd"/>
+            <w:r>
+              <w:t xml:space="preserve"> </w:t>
+            </w:r>
+            <w:proofErr w:type="spellStart"/>
+            <w:r>
+              <w:t>pembelian</w:t>
+            </w:r>
+            <w:proofErr w:type="spellEnd"/>
+            <w:r>
+              <w:t xml:space="preserve">. </w:t>
+            </w:r>
+            <w:proofErr w:type="spellStart"/>
+            <w:r>
+              <w:t>Sistem</w:t>
+            </w:r>
+            <w:proofErr w:type="spellEnd"/>
+            <w:r>
+              <w:t xml:space="preserve"> </w:t>
+            </w:r>
+            <w:proofErr w:type="spellStart"/>
+            <w:r>
+              <w:t>menghitung</w:t>
+            </w:r>
+            <w:proofErr w:type="spellEnd"/>
+            <w:r>
+              <w:t xml:space="preserve"> total </w:t>
+            </w:r>
+            <w:proofErr w:type="spellStart"/>
+            <w:r>
+              <w:t>pembayaran</w:t>
+            </w:r>
+            <w:proofErr w:type="spellEnd"/>
+            <w:r>
+              <w:t xml:space="preserve"> dan </w:t>
+            </w:r>
+            <w:proofErr w:type="spellStart"/>
+            <w:r>
+              <w:t>menyimpan</w:t>
+            </w:r>
+            <w:proofErr w:type="spellEnd"/>
+            <w:r>
+              <w:t xml:space="preserve"> data </w:t>
+            </w:r>
+            <w:proofErr w:type="spellStart"/>
+            <w:r>
+              <w:t>transaksi</w:t>
+            </w:r>
+            <w:proofErr w:type="spellEnd"/>
+            <w:r>
+              <w:t xml:space="preserve"> </w:t>
+            </w:r>
+            <w:proofErr w:type="spellStart"/>
+            <w:r>
+              <w:t>ke</w:t>
+            </w:r>
+            <w:proofErr w:type="spellEnd"/>
+            <w:r>
+              <w:t xml:space="preserve"> database. </w:t>
+            </w:r>
+            <w:proofErr w:type="spellStart"/>
+            <w:r>
+              <w:t>Setelah</w:t>
+            </w:r>
+            <w:proofErr w:type="spellEnd"/>
+            <w:r>
+              <w:t xml:space="preserve"> </w:t>
+            </w:r>
+            <w:proofErr w:type="spellStart"/>
+            <w:r>
+              <w:t>transaksi</w:t>
+            </w:r>
+            <w:proofErr w:type="spellEnd"/>
+            <w:r>
+              <w:t xml:space="preserve"> </w:t>
+            </w:r>
+            <w:proofErr w:type="spellStart"/>
+            <w:r>
+              <w:t>berhasil</w:t>
+            </w:r>
+            <w:proofErr w:type="spellEnd"/>
+            <w:r>
+              <w:t xml:space="preserve">, </w:t>
+            </w:r>
+            <w:proofErr w:type="spellStart"/>
+            <w:r>
+              <w:t>stok</w:t>
+            </w:r>
+            <w:proofErr w:type="spellEnd"/>
+            <w:r>
+              <w:t xml:space="preserve"> </w:t>
+            </w:r>
+            <w:proofErr w:type="spellStart"/>
+            <w:r>
+              <w:t>produk</w:t>
+            </w:r>
+            <w:proofErr w:type="spellEnd"/>
+            <w:r>
+              <w:t xml:space="preserve"> </w:t>
+            </w:r>
+            <w:proofErr w:type="spellStart"/>
+            <w:r>
+              <w:t>akan</w:t>
+            </w:r>
+            <w:proofErr w:type="spellEnd"/>
+            <w:r>
+              <w:t xml:space="preserve"> </w:t>
+            </w:r>
+            <w:proofErr w:type="spellStart"/>
+            <w:r>
+              <w:t>diperbarui</w:t>
+            </w:r>
+            <w:proofErr w:type="spellEnd"/>
+            <w:r>
+              <w:t xml:space="preserve"> </w:t>
+            </w:r>
+            <w:proofErr w:type="spellStart"/>
+            <w:r>
+              <w:t>secara</w:t>
+            </w:r>
+            <w:proofErr w:type="spellEnd"/>
+            <w:r>
+              <w:t xml:space="preserve"> </w:t>
+            </w:r>
+            <w:proofErr w:type="spellStart"/>
+            <w:r>
+              <w:t>otomatis</w:t>
+            </w:r>
+            <w:proofErr w:type="spellEnd"/>
+            <w:r>
+              <w:t xml:space="preserve"> </w:t>
+            </w:r>
+            <w:proofErr w:type="spellStart"/>
+            <w:r>
+              <w:t>sesuai</w:t>
+            </w:r>
+            <w:proofErr w:type="spellEnd"/>
+            <w:r>
+              <w:t xml:space="preserve"> </w:t>
+            </w:r>
+            <w:proofErr w:type="spellStart"/>
+            <w:r>
+              <w:t>dengan</w:t>
+            </w:r>
+            <w:proofErr w:type="spellEnd"/>
+            <w:r>
+              <w:t xml:space="preserve"> </w:t>
+            </w:r>
+            <w:proofErr w:type="spellStart"/>
+            <w:r>
+              <w:t>jumlah</w:t>
+            </w:r>
+            <w:proofErr w:type="spellEnd"/>
+            <w:r>
+              <w:t xml:space="preserve"> </w:t>
+            </w:r>
+            <w:proofErr w:type="spellStart"/>
+            <w:r>
+              <w:t>produk</w:t>
+            </w:r>
+            <w:proofErr w:type="spellEnd"/>
+            <w:r>
+              <w:t xml:space="preserve"> yang </w:t>
+            </w:r>
+            <w:proofErr w:type="spellStart"/>
+            <w:r>
+              <w:t>terjual</w:t>
+            </w:r>
+            <w:proofErr w:type="spellEnd"/>
+            <w:r>
+              <w:t>.</w:t>
+            </w:r>
+          </w:p>
+          <w:p>
+            <w:pPr>
+              <w:spacing w:after="60"/>
+            </w:pPr>
+            <w:proofErr w:type="spellStart"/>
+            <w:r>
+              <w:t>Setelah</w:t>
+            </w:r>
+            <w:proofErr w:type="spellEnd"/>
+            <w:r>
+              <w:t xml:space="preserve"> </w:t>
+            </w:r>
+            <w:proofErr w:type="spellStart"/>
+            <w:r>
+              <w:t>selesai</w:t>
+            </w:r>
+            <w:proofErr w:type="spellEnd"/>
+            <w:r>
+              <w:t xml:space="preserve"> </w:t>
+            </w:r>
+            <w:proofErr w:type="spellStart"/>
+            <w:r>
+              <w:t>menggunakan</w:t>
+            </w:r>
+            <w:proofErr w:type="spellEnd"/>
+            <w:r>
+              <w:t xml:space="preserve"> </w:t>
+            </w:r>
+            <w:proofErr w:type="spellStart"/>
+            <w:r>
+              <w:t>sistem</w:t>
+            </w:r>
+            <w:proofErr w:type="spellEnd"/>
+            <w:r>
+              <w:t xml:space="preserve">, </w:t>
+            </w:r>
+            <w:proofErr w:type="spellStart"/>
+            <w:r>
+              <w:t>pengguna</w:t>
+            </w:r>
+            <w:proofErr w:type="spellEnd"/>
+            <w:r>
+              <w:t xml:space="preserve"> </w:t>
+            </w:r>
+            <w:proofErr w:type="spellStart"/>
+            <w:r>
+              <w:t>dapat</w:t>
+            </w:r>
+            <w:proofErr w:type="spellEnd"/>
+            <w:r>
+              <w:t xml:space="preserve"> </w:t>
+            </w:r>
+            <w:proofErr w:type="spellStart"/>
+            <w:r>
+              <w:t>melakukan</w:t>
+            </w:r>
+            <w:proofErr w:type="spellEnd"/>
+            <w:r>
+              <w:t xml:space="preserve"> logout </w:t>
+            </w:r>
+            <w:proofErr w:type="spellStart"/>
+            <w:r>
+              <w:t>untuk</w:t>
+            </w:r>
+            <w:proofErr w:type="spellEnd"/>
+            <w:r>
+              <w:t xml:space="preserve"> </w:t>
+            </w:r>
+            <w:proofErr w:type="spellStart"/>
+            <w:r>
+              <w:t>mengakhiri</w:t>
+            </w:r>
+            <w:proofErr w:type="spellEnd"/>
+            <w:r>
+              <w:t xml:space="preserve"> </w:t>
+            </w:r>
+            <w:proofErr w:type="spellStart"/>
+            <w:r>
+              <w:t>sesi</w:t>
+            </w:r>
+            <w:proofErr w:type="spellEnd"/>
+            <w:proofErr w:type="gramStart"/>
+            <w:r>
+              <w:t>.</w:t>
+            </w:r>
+            <w:r>
+              <w:t xml:space="preserve"> </w:t>
+            </w:r>
+            <w:r>
               <w:t>]</w:t>
             </w:r>
+            <w:proofErr w:type="gramEnd"/>
           </w:p>
           <w:p>
             <w:pPr>
@@ -11150,6 +13390,7 @@
         <w:pStyle w:val="Judul2"/>
       </w:pPr>
       <w:r>
+        <w:lastRenderedPageBreak/>
         <w:t>4.2 Flowchart / Activity Diagram</w:t>
       </w:r>
     </w:p>
@@ -11209,6 +13450,7 @@
                 <w:b/>
                 <w:bCs/>
               </w:rPr>
+              <w:lastRenderedPageBreak/>
               <w:t>[</w:t>
             </w:r>
             <w:proofErr w:type="spellStart"/>
@@ -11258,51 +13500,60 @@
             <w:pPr>
               <w:spacing w:after="120"/>
             </w:pPr>
-          </w:p>
-          <w:p>
-            <w:pPr>
-              <w:spacing w:after="120"/>
-            </w:pPr>
-          </w:p>
-          <w:p>
-            <w:pPr>
-              <w:spacing w:after="120"/>
-            </w:pPr>
-          </w:p>
-          <w:p>
-            <w:pPr>
-              <w:spacing w:after="120"/>
-            </w:pPr>
-          </w:p>
-          <w:p>
-            <w:pPr>
-              <w:spacing w:after="120"/>
-            </w:pPr>
-          </w:p>
-          <w:p>
-            <w:pPr>
-              <w:spacing w:after="120"/>
-            </w:pPr>
-          </w:p>
-          <w:p>
-            <w:pPr>
-              <w:spacing w:after="120"/>
-            </w:pPr>
-          </w:p>
-          <w:p>
-            <w:pPr>
-              <w:spacing w:after="120"/>
-            </w:pPr>
-          </w:p>
-          <w:p>
-            <w:pPr>
-              <w:spacing w:after="120"/>
-            </w:pPr>
-          </w:p>
-          <w:p>
-            <w:pPr>
-              <w:spacing w:after="120"/>
-            </w:pPr>
+            <w:r>
+              <w:rPr>
+                <w:noProof/>
+              </w:rPr>
+              <w:lastRenderedPageBreak/>
+              <w:drawing>
+                <wp:inline distT="0" distB="0" distL="0" distR="0" wp14:anchorId="12574BB9" wp14:editId="7F142186">
+                  <wp:extent cx="5191125" cy="7786689"/>
+                  <wp:effectExtent l="0" t="0" r="0" b="5080"/>
+                  <wp:docPr id="2010649569" name="Gambar 7"/>
+                  <wp:cNvGraphicFramePr>
+                    <a:graphicFrameLocks xmlns:a="http://schemas.openxmlformats.org/drawingml/2006/main" noChangeAspect="1"/>
+                  </wp:cNvGraphicFramePr>
+                  <a:graphic xmlns:a="http://schemas.openxmlformats.org/drawingml/2006/main">
+                    <a:graphicData uri="http://schemas.openxmlformats.org/drawingml/2006/picture">
+                      <pic:pic xmlns:pic="http://schemas.openxmlformats.org/drawingml/2006/picture">
+                        <pic:nvPicPr>
+                          <pic:cNvPr id="0" name="Picture 7"/>
+                          <pic:cNvPicPr>
+                            <a:picLocks noChangeAspect="1" noChangeArrowheads="1"/>
+                          </pic:cNvPicPr>
+                        </pic:nvPicPr>
+                        <pic:blipFill>
+                          <a:blip r:embed="rId8" cstate="print">
+                            <a:extLst>
+                              <a:ext uri="{28A0092B-C50C-407E-A947-70E740481C1C}">
+                                <a14:useLocalDpi xmlns:a14="http://schemas.microsoft.com/office/drawing/2010/main" val="0"/>
+                              </a:ext>
+                            </a:extLst>
+                          </a:blip>
+                          <a:srcRect/>
+                          <a:stretch>
+                            <a:fillRect/>
+                          </a:stretch>
+                        </pic:blipFill>
+                        <pic:spPr bwMode="auto">
+                          <a:xfrm>
+                            <a:off x="0" y="0"/>
+                            <a:ext cx="5235619" cy="7853430"/>
+                          </a:xfrm>
+                          <a:prstGeom prst="rect">
+                            <a:avLst/>
+                          </a:prstGeom>
+                          <a:noFill/>
+                          <a:ln>
+                            <a:noFill/>
+                          </a:ln>
+                        </pic:spPr>
+                      </pic:pic>
+                    </a:graphicData>
+                  </a:graphic>
+                </wp:inline>
+              </w:drawing>
+            </w:r>
           </w:p>
           <w:p>
             <w:pPr>
@@ -11317,6 +13568,7 @@
         <w:pStyle w:val="Judul2"/>
       </w:pPr>
       <w:r>
+        <w:lastRenderedPageBreak/>
         <w:t xml:space="preserve">4.3 </w:t>
       </w:r>
       <w:proofErr w:type="spellStart"/>
@@ -11518,6 +13770,9 @@
             <w:pPr>
               <w:spacing w:after="120"/>
             </w:pPr>
+            <w:r>
+              <w:t>Login</w:t>
+            </w:r>
           </w:p>
         </w:tc>
         <w:tc>
@@ -11541,6 +13796,78 @@
             <w:pPr>
               <w:spacing w:after="120"/>
             </w:pPr>
+            <w:proofErr w:type="spellStart"/>
+            <w:r>
+              <w:t>Pengguna</w:t>
+            </w:r>
+            <w:proofErr w:type="spellEnd"/>
+            <w:r>
+              <w:t xml:space="preserve"> </w:t>
+            </w:r>
+            <w:proofErr w:type="spellStart"/>
+            <w:r>
+              <w:t>memasukkan</w:t>
+            </w:r>
+            <w:proofErr w:type="spellEnd"/>
+            <w:r>
+              <w:t xml:space="preserve"> username dan password. </w:t>
+            </w:r>
+            <w:proofErr w:type="spellStart"/>
+            <w:r>
+              <w:t>Sistem</w:t>
+            </w:r>
+            <w:proofErr w:type="spellEnd"/>
+            <w:r>
+              <w:t xml:space="preserve"> </w:t>
+            </w:r>
+            <w:proofErr w:type="spellStart"/>
+            <w:r>
+              <w:t>melakukan</w:t>
+            </w:r>
+            <w:proofErr w:type="spellEnd"/>
+            <w:r>
+              <w:t xml:space="preserve"> </w:t>
+            </w:r>
+            <w:proofErr w:type="spellStart"/>
+            <w:r>
+              <w:t>validasi</w:t>
+            </w:r>
+            <w:proofErr w:type="spellEnd"/>
+            <w:r>
+              <w:t xml:space="preserve"> dan </w:t>
+            </w:r>
+            <w:proofErr w:type="spellStart"/>
+            <w:r>
+              <w:t>memberikan</w:t>
+            </w:r>
+            <w:proofErr w:type="spellEnd"/>
+            <w:r>
+              <w:t xml:space="preserve"> </w:t>
+            </w:r>
+            <w:proofErr w:type="spellStart"/>
+            <w:r>
+              <w:t>akses</w:t>
+            </w:r>
+            <w:proofErr w:type="spellEnd"/>
+            <w:r>
+              <w:t xml:space="preserve"> </w:t>
+            </w:r>
+            <w:proofErr w:type="spellStart"/>
+            <w:r>
+              <w:t>sesuai</w:t>
+            </w:r>
+            <w:proofErr w:type="spellEnd"/>
+            <w:r>
+              <w:t xml:space="preserve"> role </w:t>
+            </w:r>
+            <w:proofErr w:type="spellStart"/>
+            <w:r>
+              <w:t>pengguna</w:t>
+            </w:r>
+            <w:proofErr w:type="spellEnd"/>
+            <w:r>
+              <w:t>.</w:t>
+            </w:r>
           </w:p>
         </w:tc>
       </w:tr>
@@ -11599,6 +13926,14 @@
             <w:pPr>
               <w:spacing w:after="120"/>
             </w:pPr>
+            <w:proofErr w:type="spellStart"/>
+            <w:r>
+              <w:t>Pengelolaan</w:t>
+            </w:r>
+            <w:proofErr w:type="spellEnd"/>
+            <w:r>
+              <w:t xml:space="preserve"> Data</w:t>
+            </w:r>
           </w:p>
         </w:tc>
         <w:tc>
@@ -11618,6 +13953,163 @@
             </w:tcMar>
             <w:vAlign w:val="center"/>
           </w:tcPr>
+          <w:tbl>
+            <w:tblPr>
+              <w:tblW w:w="0" w:type="auto"/>
+              <w:tblCellSpacing w:w="15" w:type="dxa"/>
+              <w:tblCellMar>
+                <w:top w:w="15" w:type="dxa"/>
+                <w:left w:w="15" w:type="dxa"/>
+                <w:bottom w:w="15" w:type="dxa"/>
+                <w:right w:w="15" w:type="dxa"/>
+              </w:tblCellMar>
+              <w:tblLook w:val="04A0" w:firstRow="1" w:lastRow="0" w:firstColumn="1" w:lastColumn="0" w:noHBand="0" w:noVBand="1"/>
+            </w:tblPr>
+            <w:tblGrid>
+              <w:gridCol w:w="96"/>
+            </w:tblGrid>
+            <w:tr>
+              <w:trPr>
+                <w:tblCellSpacing w:w="15" w:type="dxa"/>
+              </w:trPr>
+              <w:tc>
+                <w:tcPr>
+                  <w:tcW w:w="0" w:type="auto"/>
+                  <w:vAlign w:val="center"/>
+                  <w:hideMark/>
+                </w:tcPr>
+                <w:p>
+                  <w:pPr>
+                    <w:spacing w:after="120"/>
+                  </w:pPr>
+                </w:p>
+              </w:tc>
+            </w:tr>
+          </w:tbl>
+          <w:p>
+            <w:pPr>
+              <w:spacing w:after="120"/>
+              <w:rPr>
+                <w:vanish/>
+              </w:rPr>
+            </w:pPr>
+          </w:p>
+          <w:tbl>
+            <w:tblPr>
+              <w:tblW w:w="0" w:type="auto"/>
+              <w:tblCellSpacing w:w="15" w:type="dxa"/>
+              <w:tblCellMar>
+                <w:top w:w="15" w:type="dxa"/>
+                <w:left w:w="15" w:type="dxa"/>
+                <w:bottom w:w="15" w:type="dxa"/>
+                <w:right w:w="15" w:type="dxa"/>
+              </w:tblCellMar>
+              <w:tblLook w:val="04A0" w:firstRow="1" w:lastRow="0" w:firstColumn="1" w:lastColumn="0" w:noHBand="0" w:noVBand="1"/>
+            </w:tblPr>
+            <w:tblGrid>
+              <w:gridCol w:w="5632"/>
+            </w:tblGrid>
+            <w:tr>
+              <w:trPr>
+                <w:tblCellSpacing w:w="15" w:type="dxa"/>
+              </w:trPr>
+              <w:tc>
+                <w:tcPr>
+                  <w:tcW w:w="0" w:type="auto"/>
+                  <w:vAlign w:val="center"/>
+                  <w:hideMark/>
+                </w:tcPr>
+                <w:p>
+                  <w:pPr>
+                    <w:spacing w:after="120"/>
+                  </w:pPr>
+                  <w:r>
+                    <w:t xml:space="preserve">Admin </w:t>
+                  </w:r>
+                  <w:proofErr w:type="spellStart"/>
+                  <w:r>
+                    <w:t>mengelola</w:t>
+                  </w:r>
+                  <w:proofErr w:type="spellEnd"/>
+                  <w:r>
+                    <w:t xml:space="preserve"> data </w:t>
+                  </w:r>
+                  <w:proofErr w:type="spellStart"/>
+                  <w:r>
+                    <w:t>produk</w:t>
+                  </w:r>
+                  <w:proofErr w:type="spellEnd"/>
+                  <w:r>
+                    <w:t xml:space="preserve"> dan </w:t>
+                  </w:r>
+                  <w:proofErr w:type="spellStart"/>
+                  <w:r>
+                    <w:t>pelanggan</w:t>
+                  </w:r>
+                  <w:proofErr w:type="spellEnd"/>
+                  <w:r>
+                    <w:t xml:space="preserve">, </w:t>
+                  </w:r>
+                  <w:proofErr w:type="spellStart"/>
+                  <w:r>
+                    <w:t>sedangkan</w:t>
+                  </w:r>
+                  <w:proofErr w:type="spellEnd"/>
+                  <w:r>
+                    <w:t xml:space="preserve"> Kasir </w:t>
+                  </w:r>
+                  <w:proofErr w:type="spellStart"/>
+                  <w:r>
+                    <w:t>dapat</w:t>
+                  </w:r>
+                  <w:proofErr w:type="spellEnd"/>
+                  <w:r>
+                    <w:t xml:space="preserve"> </w:t>
+                  </w:r>
+                  <w:proofErr w:type="spellStart"/>
+                  <w:r>
+                    <w:t>melihat</w:t>
+                  </w:r>
+                  <w:proofErr w:type="spellEnd"/>
+                  <w:r>
+                    <w:t xml:space="preserve"> dan </w:t>
+                  </w:r>
+                  <w:proofErr w:type="spellStart"/>
+                  <w:r>
+                    <w:t>mencari</w:t>
+                  </w:r>
+                  <w:proofErr w:type="spellEnd"/>
+                  <w:r>
+                    <w:t xml:space="preserve"> data yang </w:t>
+                  </w:r>
+                  <w:proofErr w:type="spellStart"/>
+                  <w:r>
+                    <w:t>diperlukan</w:t>
+                  </w:r>
+                  <w:proofErr w:type="spellEnd"/>
+                  <w:r>
+                    <w:t xml:space="preserve"> </w:t>
+                  </w:r>
+                  <w:proofErr w:type="spellStart"/>
+                  <w:r>
+                    <w:t>untuk</w:t>
+                  </w:r>
+                  <w:proofErr w:type="spellEnd"/>
+                  <w:r>
+                    <w:t xml:space="preserve"> </w:t>
+                  </w:r>
+                  <w:proofErr w:type="spellStart"/>
+                  <w:r>
+                    <w:t>transaksi</w:t>
+                  </w:r>
+                  <w:proofErr w:type="spellEnd"/>
+                  <w:r>
+                    <w:t>.</w:t>
+                  </w:r>
+                </w:p>
+              </w:tc>
+            </w:tr>
+          </w:tbl>
           <w:p>
             <w:pPr>
               <w:spacing w:after="120"/>
@@ -11680,6 +14172,19 @@
             <w:pPr>
               <w:spacing w:after="120"/>
             </w:pPr>
+            <w:proofErr w:type="spellStart"/>
+            <w:r>
+              <w:t>Transaksi</w:t>
+            </w:r>
+            <w:proofErr w:type="spellEnd"/>
+            <w:r>
+              <w:t xml:space="preserve"> </w:t>
+            </w:r>
+            <w:proofErr w:type="spellStart"/>
+            <w:r>
+              <w:t>Penjualan</w:t>
+            </w:r>
+            <w:proofErr w:type="spellEnd"/>
           </w:p>
         </w:tc>
         <w:tc>
@@ -11703,6 +14208,81 @@
             <w:pPr>
               <w:spacing w:after="120"/>
             </w:pPr>
+            <w:r>
+              <w:t xml:space="preserve">Kasir </w:t>
+            </w:r>
+            <w:proofErr w:type="spellStart"/>
+            <w:r>
+              <w:t>memilih</w:t>
+            </w:r>
+            <w:proofErr w:type="spellEnd"/>
+            <w:r>
+              <w:t xml:space="preserve"> </w:t>
+            </w:r>
+            <w:proofErr w:type="spellStart"/>
+            <w:r>
+              <w:t>produk</w:t>
+            </w:r>
+            <w:proofErr w:type="spellEnd"/>
+            <w:r>
+              <w:t xml:space="preserve">, </w:t>
+            </w:r>
+            <w:proofErr w:type="spellStart"/>
+            <w:r>
+              <w:t>memasukkan</w:t>
+            </w:r>
+            <w:proofErr w:type="spellEnd"/>
+            <w:r>
+              <w:t xml:space="preserve"> </w:t>
+            </w:r>
+            <w:proofErr w:type="spellStart"/>
+            <w:r>
+              <w:t>jumlah</w:t>
+            </w:r>
+            <w:proofErr w:type="spellEnd"/>
+            <w:r>
+              <w:t xml:space="preserve"> </w:t>
+            </w:r>
+            <w:proofErr w:type="spellStart"/>
+            <w:r>
+              <w:t>pembelian</w:t>
+            </w:r>
+            <w:proofErr w:type="spellEnd"/>
+            <w:r>
+              <w:t xml:space="preserve">, </w:t>
+            </w:r>
+            <w:proofErr w:type="spellStart"/>
+            <w:r>
+              <w:t>kemudian</w:t>
+            </w:r>
+            <w:proofErr w:type="spellEnd"/>
+            <w:r>
+              <w:t xml:space="preserve"> </w:t>
+            </w:r>
+            <w:proofErr w:type="spellStart"/>
+            <w:r>
+              <w:t>sistem</w:t>
+            </w:r>
+            <w:proofErr w:type="spellEnd"/>
+            <w:r>
+              <w:t xml:space="preserve"> </w:t>
+            </w:r>
+            <w:proofErr w:type="spellStart"/>
+            <w:r>
+              <w:t>menghitung</w:t>
+            </w:r>
+            <w:proofErr w:type="spellEnd"/>
+            <w:r>
+              <w:t xml:space="preserve"> total </w:t>
+            </w:r>
+            <w:proofErr w:type="spellStart"/>
+            <w:r>
+              <w:t>transaksi</w:t>
+            </w:r>
+            <w:proofErr w:type="spellEnd"/>
+            <w:r>
+              <w:t>.</w:t>
+            </w:r>
           </w:p>
         </w:tc>
       </w:tr>
@@ -11736,7 +14316,6 @@
               <w:jc w:val="center"/>
             </w:pPr>
             <w:r>
-              <w:lastRenderedPageBreak/>
               <w:t>4</w:t>
             </w:r>
           </w:p>
@@ -11762,6 +14341,14 @@
             <w:pPr>
               <w:spacing w:after="120"/>
             </w:pPr>
+            <w:proofErr w:type="spellStart"/>
+            <w:r>
+              <w:t>Pembaruan</w:t>
+            </w:r>
+            <w:proofErr w:type="spellEnd"/>
+            <w:r>
+              <w:t xml:space="preserve"> Stok</w:t>
+            </w:r>
           </w:p>
         </w:tc>
         <w:tc>
@@ -11785,6 +14372,94 @@
             <w:pPr>
               <w:spacing w:after="120"/>
             </w:pPr>
+            <w:proofErr w:type="spellStart"/>
+            <w:r>
+              <w:t>Setelah</w:t>
+            </w:r>
+            <w:proofErr w:type="spellEnd"/>
+            <w:r>
+              <w:t xml:space="preserve"> </w:t>
+            </w:r>
+            <w:proofErr w:type="spellStart"/>
+            <w:r>
+              <w:t>transaksi</w:t>
+            </w:r>
+            <w:proofErr w:type="spellEnd"/>
+            <w:r>
+              <w:t xml:space="preserve"> </w:t>
+            </w:r>
+            <w:proofErr w:type="spellStart"/>
+            <w:r>
+              <w:t>berhasil</w:t>
+            </w:r>
+            <w:proofErr w:type="spellEnd"/>
+            <w:r>
+              <w:t xml:space="preserve"> </w:t>
+            </w:r>
+            <w:proofErr w:type="spellStart"/>
+            <w:r>
+              <w:t>disimpan</w:t>
+            </w:r>
+            <w:proofErr w:type="spellEnd"/>
+            <w:r>
+              <w:t xml:space="preserve">, </w:t>
+            </w:r>
+            <w:proofErr w:type="spellStart"/>
+            <w:r>
+              <w:t>sistem</w:t>
+            </w:r>
+            <w:proofErr w:type="spellEnd"/>
+            <w:r>
+              <w:t xml:space="preserve"> </w:t>
+            </w:r>
+            <w:proofErr w:type="spellStart"/>
+            <w:r>
+              <w:t>mengurangi</w:t>
+            </w:r>
+            <w:proofErr w:type="spellEnd"/>
+            <w:r>
+              <w:t xml:space="preserve"> </w:t>
+            </w:r>
+            <w:proofErr w:type="spellStart"/>
+            <w:r>
+              <w:t>stok</w:t>
+            </w:r>
+            <w:proofErr w:type="spellEnd"/>
+            <w:r>
+              <w:t xml:space="preserve"> </w:t>
+            </w:r>
+            <w:proofErr w:type="spellStart"/>
+            <w:r>
+              <w:t>produk</w:t>
+            </w:r>
+            <w:proofErr w:type="spellEnd"/>
+            <w:r>
+              <w:t xml:space="preserve"> </w:t>
+            </w:r>
+            <w:proofErr w:type="spellStart"/>
+            <w:r>
+              <w:t>sesuai</w:t>
+            </w:r>
+            <w:proofErr w:type="spellEnd"/>
+            <w:r>
+              <w:t xml:space="preserve"> </w:t>
+            </w:r>
+            <w:proofErr w:type="spellStart"/>
+            <w:r>
+              <w:t>jumlah</w:t>
+            </w:r>
+            <w:proofErr w:type="spellEnd"/>
+            <w:r>
+              <w:t xml:space="preserve"> yang </w:t>
+            </w:r>
+            <w:proofErr w:type="spellStart"/>
+            <w:r>
+              <w:t>terjual</w:t>
+            </w:r>
+            <w:proofErr w:type="spellEnd"/>
+            <w:r>
+              <w:t>.</w:t>
+            </w:r>
           </w:p>
         </w:tc>
       </w:tr>
@@ -11843,6 +14518,11 @@
             <w:pPr>
               <w:spacing w:after="120"/>
             </w:pPr>
+            <w:proofErr w:type="spellStart"/>
+            <w:r>
+              <w:t>Laporan</w:t>
+            </w:r>
+            <w:proofErr w:type="spellEnd"/>
           </w:p>
         </w:tc>
         <w:tc>
@@ -11866,6 +14546,97 @@
             <w:pPr>
               <w:spacing w:after="120"/>
             </w:pPr>
+            <w:r>
+              <w:t xml:space="preserve">Admin </w:t>
+            </w:r>
+            <w:proofErr w:type="spellStart"/>
+            <w:r>
+              <w:t>melihat</w:t>
+            </w:r>
+            <w:proofErr w:type="spellEnd"/>
+            <w:r>
+              <w:t xml:space="preserve"> data </w:t>
+            </w:r>
+            <w:proofErr w:type="spellStart"/>
+            <w:r>
+              <w:t>transaksi</w:t>
+            </w:r>
+            <w:proofErr w:type="spellEnd"/>
+            <w:r>
+              <w:t xml:space="preserve"> yang </w:t>
+            </w:r>
+            <w:proofErr w:type="spellStart"/>
+            <w:r>
+              <w:t>telah</w:t>
+            </w:r>
+            <w:proofErr w:type="spellEnd"/>
+            <w:r>
+              <w:t xml:space="preserve"> </w:t>
+            </w:r>
+            <w:proofErr w:type="spellStart"/>
+            <w:r>
+              <w:t>tersimpan</w:t>
+            </w:r>
+            <w:proofErr w:type="spellEnd"/>
+            <w:r>
+              <w:t xml:space="preserve"> </w:t>
+            </w:r>
+            <w:proofErr w:type="spellStart"/>
+            <w:r>
+              <w:t>untuk</w:t>
+            </w:r>
+            <w:proofErr w:type="spellEnd"/>
+            <w:r>
+              <w:t xml:space="preserve"> </w:t>
+            </w:r>
+            <w:proofErr w:type="spellStart"/>
+            <w:r>
+              <w:t>mengetahui</w:t>
+            </w:r>
+            <w:proofErr w:type="spellEnd"/>
+            <w:r>
+              <w:t xml:space="preserve"> </w:t>
+            </w:r>
+            <w:proofErr w:type="spellStart"/>
+            <w:r>
+              <w:t>informasi</w:t>
+            </w:r>
+            <w:proofErr w:type="spellEnd"/>
+            <w:r>
+              <w:t xml:space="preserve"> </w:t>
+            </w:r>
+            <w:proofErr w:type="spellStart"/>
+            <w:r>
+              <w:t>penjualan</w:t>
+            </w:r>
+            <w:proofErr w:type="spellEnd"/>
+            <w:r>
+              <w:t xml:space="preserve"> </w:t>
+            </w:r>
+            <w:proofErr w:type="spellStart"/>
+            <w:r>
+              <w:t>berdasarkan</w:t>
+            </w:r>
+            <w:proofErr w:type="spellEnd"/>
+            <w:r>
+              <w:t xml:space="preserve"> </w:t>
+            </w:r>
+            <w:proofErr w:type="spellStart"/>
+            <w:r>
+              <w:t>periode</w:t>
+            </w:r>
+            <w:proofErr w:type="spellEnd"/>
+            <w:r>
+              <w:t xml:space="preserve"> </w:t>
+            </w:r>
+            <w:proofErr w:type="spellStart"/>
+            <w:r>
+              <w:t>tertentu</w:t>
+            </w:r>
+            <w:proofErr w:type="spellEnd"/>
+            <w:r>
+              <w:t>.</w:t>
+            </w:r>
           </w:p>
         </w:tc>
       </w:tr>
@@ -22561,8 +25332,8 @@
     </w:tbl>
     <w:p/>
     <w:sectPr>
-      <w:headerReference w:type="default" r:id="rId7"/>
-      <w:footerReference w:type="default" r:id="rId8"/>
+      <w:headerReference w:type="default" r:id="rId9"/>
+      <w:footerReference w:type="default" r:id="rId10"/>
       <w:pgSz w:w="11906" w:h="16838"/>
       <w:pgMar w:top="1417" w:right="1417" w:bottom="1417" w:left="1417" w:header="708" w:footer="708" w:gutter="0"/>
       <w:cols w:space="720"/>
@@ -23467,6 +26238,18 @@
       <w:szCs w:val="20"/>
     </w:rPr>
   </w:style>
+  <w:style w:type="character" w:styleId="SebutanYangBelumTerselesaikan">
+    <w:name w:val="Unresolved Mention"/>
+    <w:basedOn w:val="FontParagrafDefault"/>
+    <w:uiPriority w:val="99"/>
+    <w:semiHidden/>
+    <w:unhideWhenUsed/>
+    <w:rsid w:val="001A5A6C"/>
+    <w:rPr>
+      <w:color w:val="605E5C"/>
+      <w:shd w:val="clear" w:color="auto" w:fill="E1DFDD"/>
+    </w:rPr>
+  </w:style>
 </w:styles>
 </file>
 

</xml_diff>